<commit_message>
Atualização do projeto AVCAD
</commit_message>
<xml_diff>
--- a/report/Report_AVCAD.docx
+++ b/report/Report_AVCAD.docx
@@ -387,7 +387,6 @@
           <w:lang w:val="pt-BR"/>
         </w:rPr>
       </w:pPr>
-      <w:proofErr w:type="spellStart"/>
       <w:r>
         <w:rPr>
           <w:rFonts w:ascii="Calibri"/>
@@ -408,7 +407,6 @@
         </w:rPr>
         <w:t>s</w:t>
       </w:r>
-      <w:proofErr w:type="spellEnd"/>
       <w:r>
         <w:rPr>
           <w:rFonts w:ascii="Calibri"/>
@@ -530,7 +528,6 @@
         </w:rPr>
         <w:t xml:space="preserve">Andrea </w:t>
       </w:r>
-      <w:proofErr w:type="spellStart"/>
       <w:r>
         <w:rPr>
           <w:rFonts w:ascii="Calibri" w:hAnsi="Calibri"/>
@@ -539,7 +536,6 @@
         </w:rPr>
         <w:t>Dombe</w:t>
       </w:r>
-      <w:proofErr w:type="spellEnd"/>
     </w:p>
     <w:p>
       <w:pPr>
@@ -1760,47 +1756,7 @@
                 <w:szCs w:val="20"/>
                 <w:lang w:eastAsia="pt-PT"/>
               </w:rPr>
-              <w:t xml:space="preserve">To </w:t>
-            </w:r>
-            <w:proofErr w:type="spellStart"/>
-            <w:r>
-              <w:rPr>
-                <w:color w:val="000000"/>
-                <w:sz w:val="20"/>
-                <w:szCs w:val="20"/>
-                <w:lang w:eastAsia="pt-PT"/>
-              </w:rPr>
-              <w:t>analyse</w:t>
-            </w:r>
-            <w:proofErr w:type="spellEnd"/>
-            <w:r>
-              <w:rPr>
-                <w:color w:val="000000"/>
-                <w:sz w:val="20"/>
-                <w:szCs w:val="20"/>
-                <w:lang w:eastAsia="pt-PT"/>
-              </w:rPr>
-              <w:t xml:space="preserve"> whether agricultural </w:t>
-            </w:r>
-            <w:proofErr w:type="spellStart"/>
-            <w:r>
-              <w:rPr>
-                <w:color w:val="000000"/>
-                <w:sz w:val="20"/>
-                <w:szCs w:val="20"/>
-                <w:lang w:eastAsia="pt-PT"/>
-              </w:rPr>
-              <w:t>labour</w:t>
-            </w:r>
-            <w:proofErr w:type="spellEnd"/>
-            <w:r>
-              <w:rPr>
-                <w:color w:val="000000"/>
-                <w:sz w:val="20"/>
-                <w:szCs w:val="20"/>
-                <w:lang w:eastAsia="pt-PT"/>
-              </w:rPr>
-              <w:t xml:space="preserve"> decreased between 1989 and 2019</w:t>
+              <w:t>To analyse whether agricultural labour decreased between 1989 and 2019</w:t>
             </w:r>
           </w:p>
         </w:tc>
@@ -2114,27 +2070,7 @@
                 <w:szCs w:val="20"/>
                 <w:lang w:eastAsia="pt-PT"/>
               </w:rPr>
-              <w:t xml:space="preserve">To </w:t>
-            </w:r>
-            <w:proofErr w:type="spellStart"/>
-            <w:r>
-              <w:rPr>
-                <w:color w:val="000000"/>
-                <w:sz w:val="20"/>
-                <w:szCs w:val="20"/>
-                <w:lang w:eastAsia="pt-PT"/>
-              </w:rPr>
-              <w:t>analyse</w:t>
-            </w:r>
-            <w:proofErr w:type="spellEnd"/>
-            <w:r>
-              <w:rPr>
-                <w:color w:val="000000"/>
-                <w:sz w:val="20"/>
-                <w:szCs w:val="20"/>
-                <w:lang w:eastAsia="pt-PT"/>
-              </w:rPr>
-              <w:t xml:space="preserve"> changes in temporary crop systems</w:t>
+              <w:t>To analyse changes in temporary crop systems</w:t>
             </w:r>
           </w:p>
         </w:tc>
@@ -2605,27 +2541,7 @@
                 <w:szCs w:val="20"/>
                 <w:lang w:eastAsia="pt-PT"/>
               </w:rPr>
-              <w:t xml:space="preserve">To </w:t>
-            </w:r>
-            <w:proofErr w:type="spellStart"/>
-            <w:r>
-              <w:rPr>
-                <w:color w:val="000000"/>
-                <w:sz w:val="20"/>
-                <w:szCs w:val="20"/>
-                <w:lang w:eastAsia="pt-PT"/>
-              </w:rPr>
-              <w:t>analyse</w:t>
-            </w:r>
-            <w:proofErr w:type="spellEnd"/>
-            <w:r>
-              <w:rPr>
-                <w:color w:val="000000"/>
-                <w:sz w:val="20"/>
-                <w:szCs w:val="20"/>
-                <w:lang w:eastAsia="pt-PT"/>
-              </w:rPr>
-              <w:t xml:space="preserve"> whether structural changes were accompanied by changes in </w:t>
+              <w:t xml:space="preserve">To analyse whether structural changes were accompanied by changes in </w:t>
             </w:r>
             <w:r>
               <w:rPr>
@@ -3081,27 +2997,7 @@
                 <w:szCs w:val="20"/>
                 <w:lang w:eastAsia="pt-PT"/>
               </w:rPr>
-              <w:t xml:space="preserve">To </w:t>
-            </w:r>
-            <w:proofErr w:type="spellStart"/>
-            <w:r>
-              <w:rPr>
-                <w:color w:val="000000"/>
-                <w:sz w:val="20"/>
-                <w:szCs w:val="20"/>
-                <w:lang w:eastAsia="pt-PT"/>
-              </w:rPr>
-              <w:t>analyse</w:t>
-            </w:r>
-            <w:proofErr w:type="spellEnd"/>
-            <w:r>
-              <w:rPr>
-                <w:color w:val="000000"/>
-                <w:sz w:val="20"/>
-                <w:szCs w:val="20"/>
-                <w:lang w:eastAsia="pt-PT"/>
-              </w:rPr>
-              <w:t xml:space="preserve"> agricultural evolution over time, especially between 1989 and 2019</w:t>
+              <w:t>To analyse agricultural evolution over time, especially between 1989 and 2019</w:t>
             </w:r>
           </w:p>
         </w:tc>
@@ -3297,7 +3193,6 @@
                 <w:lang w:eastAsia="pt-PT"/>
               </w:rPr>
             </w:pPr>
-            <w:proofErr w:type="spellStart"/>
             <w:r>
               <w:rPr>
                 <w:color w:val="000000"/>
@@ -3305,17 +3200,7 @@
                 <w:szCs w:val="20"/>
                 <w:lang w:eastAsia="pt-PT"/>
               </w:rPr>
-              <w:t>Labour</w:t>
-            </w:r>
-            <w:proofErr w:type="spellEnd"/>
-            <w:r>
-              <w:rPr>
-                <w:color w:val="000000"/>
-                <w:sz w:val="20"/>
-                <w:szCs w:val="20"/>
-                <w:lang w:eastAsia="pt-PT"/>
-              </w:rPr>
-              <w:t xml:space="preserve"> force involved in agricultural activity</w:t>
+              <w:t>Labour force involved in agricultural activity</w:t>
             </w:r>
           </w:p>
         </w:tc>
@@ -3352,39 +3237,8 @@
                 <w:szCs w:val="20"/>
                 <w:lang w:eastAsia="pt-PT"/>
               </w:rPr>
-              <w:t xml:space="preserve">To test whether agricultural </w:t>
+              <w:t>To test whether agricultural labour declined over the period analysed</w:t>
             </w:r>
-            <w:proofErr w:type="spellStart"/>
-            <w:r>
-              <w:rPr>
-                <w:color w:val="000000"/>
-                <w:sz w:val="20"/>
-                <w:szCs w:val="20"/>
-                <w:lang w:eastAsia="pt-PT"/>
-              </w:rPr>
-              <w:t>labour</w:t>
-            </w:r>
-            <w:proofErr w:type="spellEnd"/>
-            <w:r>
-              <w:rPr>
-                <w:color w:val="000000"/>
-                <w:sz w:val="20"/>
-                <w:szCs w:val="20"/>
-                <w:lang w:eastAsia="pt-PT"/>
-              </w:rPr>
-              <w:t xml:space="preserve"> declined over the period </w:t>
-            </w:r>
-            <w:proofErr w:type="spellStart"/>
-            <w:r>
-              <w:rPr>
-                <w:color w:val="000000"/>
-                <w:sz w:val="20"/>
-                <w:szCs w:val="20"/>
-                <w:lang w:eastAsia="pt-PT"/>
-              </w:rPr>
-              <w:t>analysed</w:t>
-            </w:r>
-            <w:proofErr w:type="spellEnd"/>
           </w:p>
         </w:tc>
       </w:tr>
@@ -3863,27 +3717,7 @@
                 <w:szCs w:val="20"/>
                 <w:lang w:eastAsia="pt-PT"/>
               </w:rPr>
-              <w:t xml:space="preserve">To </w:t>
-            </w:r>
-            <w:proofErr w:type="spellStart"/>
-            <w:r>
-              <w:rPr>
-                <w:color w:val="000000"/>
-                <w:sz w:val="20"/>
-                <w:szCs w:val="20"/>
-                <w:lang w:eastAsia="pt-PT"/>
-              </w:rPr>
-              <w:t>analyse</w:t>
-            </w:r>
-            <w:proofErr w:type="spellEnd"/>
-            <w:r>
-              <w:rPr>
-                <w:color w:val="000000"/>
-                <w:sz w:val="20"/>
-                <w:szCs w:val="20"/>
-                <w:lang w:eastAsia="pt-PT"/>
-              </w:rPr>
-              <w:t xml:space="preserve"> changes in extensive land use and land management</w:t>
+              <w:t>To analyse changes in extensive land use and land management</w:t>
             </w:r>
           </w:p>
         </w:tc>
@@ -4085,25 +3919,25 @@
           <w:szCs w:val="22"/>
           <w:lang w:val="en-US"/>
         </w:rPr>
-        <w:t xml:space="preserve">Before starting the analysis, the datasets were imported into Python using the </w:t>
-      </w:r>
-      <w:proofErr w:type="gramStart"/>
-      <w:r>
+        <w:t>Before starting the analysis, the datasets were imported into Python using the pandas library. Each dataset was inspected to understand its structure, identify the available variables, check the data types and detect possible missing values.</w:t>
+      </w:r>
+    </w:p>
+    <w:p>
+      <w:pPr>
+        <w:pStyle w:val="NormalWeb"/>
         <w:rPr>
           <w:sz w:val="22"/>
           <w:szCs w:val="22"/>
           <w:lang w:val="en-US"/>
         </w:rPr>
-        <w:t>pandas</w:t>
-      </w:r>
-      <w:proofErr w:type="gramEnd"/>
+      </w:pPr>
       <w:r>
         <w:rPr>
           <w:sz w:val="22"/>
           <w:szCs w:val="22"/>
           <w:lang w:val="en-US"/>
         </w:rPr>
-        <w:t xml:space="preserve"> library. Each dataset was inspected to understand its structure, identify the available variables, check the data types and detect possible missing values.</w:t>
+        <w:t>The first step consisted of opening each CSV file and examining the first rows of the data. Then, the column names were checked and standardized to make the datasets easier to work with. The existence of missing values was also verified, as well as the temporal coverage and the geographical units available in each dataset.</w:t>
       </w:r>
     </w:p>
     <w:p>
@@ -4121,43 +3955,7 @@
           <w:szCs w:val="22"/>
           <w:lang w:val="en-US"/>
         </w:rPr>
-        <w:t>The first step consisted of opening each CSV file and examining the first rows of the data. Then, the column names were checked and standardized to make the datasets easier to work with. The existence of missing values was also verified, as well as the temporal coverage and the geographical units available in each dataset.</w:t>
-      </w:r>
-    </w:p>
-    <w:p>
-      <w:pPr>
-        <w:pStyle w:val="NormalWeb"/>
-        <w:rPr>
-          <w:sz w:val="22"/>
-          <w:szCs w:val="22"/>
-          <w:lang w:val="en-US"/>
-        </w:rPr>
-      </w:pPr>
-      <w:r>
-        <w:rPr>
-          <w:sz w:val="22"/>
-          <w:szCs w:val="22"/>
-          <w:lang w:val="en-US"/>
-        </w:rPr>
-        <w:t xml:space="preserve">After this initial inspection, the relevant variables were selected according to the objectives of the project. When necessary, the data were grouped by year and region to create summary tables for the </w:t>
-      </w:r>
-      <w:proofErr w:type="gramStart"/>
-      <w:r>
-        <w:rPr>
-          <w:sz w:val="22"/>
-          <w:szCs w:val="22"/>
-          <w:lang w:val="en-US"/>
-        </w:rPr>
-        <w:t>exploratory</w:t>
-      </w:r>
-      <w:proofErr w:type="gramEnd"/>
-      <w:r>
-        <w:rPr>
-          <w:sz w:val="22"/>
-          <w:szCs w:val="22"/>
-          <w:lang w:val="en-US"/>
-        </w:rPr>
-        <w:t xml:space="preserve"> analysis. These prepared datasets were then used to produce descriptive statistics, visualizations and inferential tests.</w:t>
+        <w:t>After this initial inspection, the relevant variables were selected according to the objectives of the project. When necessary, the data were grouped by year and region to create summary tables for the exploratory analysis. These prepared datasets were then used to produce descriptive statistics, visualizations and inferential tests.</w:t>
       </w:r>
     </w:p>
     <w:p>
@@ -4287,8 +4085,1751 @@
         <w:rPr>
           <w:spacing w:val="-2"/>
         </w:rPr>
-        <w:t>Evolution of agricultural labour</w:t>
-      </w:r>
+        <w:t>Evolution of</w:t>
+      </w:r>
+      <w:r>
+        <w:rPr>
+          <w:spacing w:val="-2"/>
+        </w:rPr>
+        <w:t xml:space="preserve"> Agricultural Labour in Mainland Portugal</w:t>
+      </w:r>
+    </w:p>
+    <w:p>
+      <w:pPr>
+        <w:pStyle w:val="Heading1"/>
+        <w:tabs>
+          <w:tab w:val="left" w:pos="745"/>
+        </w:tabs>
+        <w:ind w:left="37" w:firstLine="0"/>
+        <w:rPr>
+          <w:spacing w:val="-2"/>
+        </w:rPr>
+      </w:pPr>
+      <w:r>
+        <w:rPr>
+          <w:spacing w:val="-2"/>
+        </w:rPr>
+        <w:t>3.1.1    National trend (1989 -2019)</w:t>
+      </w:r>
+    </w:p>
+    <w:p>
+      <w:pPr>
+        <w:pStyle w:val="Heading1"/>
+        <w:tabs>
+          <w:tab w:val="left" w:pos="745"/>
+        </w:tabs>
+        <w:ind w:left="37" w:firstLine="0"/>
+        <w:rPr>
+          <w:rFonts w:ascii="Times New Roman" w:hAnsi="Times New Roman" w:cs="Times New Roman"/>
+          <w:i w:val="0"/>
+          <w:iCs w:val="0"/>
+          <w:spacing w:val="-2"/>
+          <w:sz w:val="22"/>
+          <w:szCs w:val="22"/>
+        </w:rPr>
+      </w:pPr>
+      <w:r>
+        <w:rPr>
+          <w:rFonts w:ascii="Times New Roman" w:hAnsi="Times New Roman" w:cs="Times New Roman"/>
+          <w:i w:val="0"/>
+          <w:iCs w:val="0"/>
+          <w:spacing w:val="-2"/>
+          <w:sz w:val="22"/>
+          <w:szCs w:val="22"/>
+        </w:rPr>
+        <w:t>According to the database</w:t>
+      </w:r>
+      <w:r>
+        <w:rPr>
+          <w:rFonts w:ascii="Times New Roman" w:hAnsi="Times New Roman" w:cs="Times New Roman"/>
+          <w:i w:val="0"/>
+          <w:iCs w:val="0"/>
+          <w:spacing w:val="-2"/>
+          <w:sz w:val="22"/>
+          <w:szCs w:val="22"/>
+        </w:rPr>
+        <w:t xml:space="preserve"> </w:t>
+      </w:r>
+      <w:r>
+        <w:rPr>
+          <w:rFonts w:ascii="Times New Roman" w:hAnsi="Times New Roman" w:cs="Times New Roman"/>
+          <w:i w:val="0"/>
+          <w:iCs w:val="0"/>
+          <w:spacing w:val="-2"/>
+          <w:sz w:val="22"/>
+          <w:szCs w:val="22"/>
+        </w:rPr>
+        <w:t>from the Instituto Nacional de Estatistica (INE), agricultural labour in the mainland has dec</w:t>
+      </w:r>
+      <w:r>
+        <w:rPr>
+          <w:rFonts w:ascii="Times New Roman" w:hAnsi="Times New Roman" w:cs="Times New Roman"/>
+          <w:i w:val="0"/>
+          <w:iCs w:val="0"/>
+          <w:spacing w:val="-2"/>
+          <w:sz w:val="22"/>
+          <w:szCs w:val="22"/>
+        </w:rPr>
+        <w:t>reased substantially between 1989 and 2019. The table below presents the evolution of the total agricultural workforce over the years 1989, 1999, 2009 and 2019.</w:t>
+      </w:r>
+    </w:p>
+    <w:p>
+      <w:pPr>
+        <w:pStyle w:val="Heading1"/>
+        <w:tabs>
+          <w:tab w:val="left" w:pos="745"/>
+        </w:tabs>
+        <w:ind w:left="37" w:firstLine="0"/>
+        <w:rPr>
+          <w:rFonts w:ascii="Times New Roman" w:hAnsi="Times New Roman" w:cs="Times New Roman"/>
+          <w:i w:val="0"/>
+          <w:iCs w:val="0"/>
+          <w:spacing w:val="-2"/>
+          <w:sz w:val="22"/>
+          <w:szCs w:val="22"/>
+        </w:rPr>
+      </w:pPr>
+    </w:p>
+    <w:p>
+      <w:pPr>
+        <w:pStyle w:val="Heading1"/>
+        <w:tabs>
+          <w:tab w:val="left" w:pos="745"/>
+        </w:tabs>
+        <w:ind w:left="37" w:firstLine="0"/>
+        <w:rPr>
+          <w:rFonts w:ascii="Times New Roman" w:hAnsi="Times New Roman" w:cs="Times New Roman"/>
+          <w:i w:val="0"/>
+          <w:iCs w:val="0"/>
+          <w:spacing w:val="-2"/>
+          <w:sz w:val="22"/>
+          <w:szCs w:val="22"/>
+        </w:rPr>
+      </w:pPr>
+      <w:r>
+        <w:rPr>
+          <w:rFonts w:ascii="Times New Roman" w:hAnsi="Times New Roman" w:cs="Times New Roman"/>
+          <w:i w:val="0"/>
+          <w:iCs w:val="0"/>
+          <w:spacing w:val="-2"/>
+          <w:sz w:val="22"/>
+          <w:szCs w:val="22"/>
+        </w:rPr>
+        <w:t xml:space="preserve">Table 3.1 </w:t>
+      </w:r>
+      <w:r>
+        <w:rPr>
+          <w:rFonts w:ascii="Times New Roman" w:hAnsi="Times New Roman" w:cs="Times New Roman"/>
+          <w:i w:val="0"/>
+          <w:iCs w:val="0"/>
+          <w:spacing w:val="-2"/>
+          <w:sz w:val="22"/>
+          <w:szCs w:val="22"/>
+        </w:rPr>
+        <w:t>-</w:t>
+      </w:r>
+      <w:r>
+        <w:rPr>
+          <w:rFonts w:ascii="Times New Roman" w:hAnsi="Times New Roman" w:cs="Times New Roman"/>
+          <w:i w:val="0"/>
+          <w:iCs w:val="0"/>
+          <w:spacing w:val="-2"/>
+          <w:sz w:val="22"/>
+          <w:szCs w:val="22"/>
+        </w:rPr>
+        <w:t xml:space="preserve"> Agricultural labour in mainland Portugal (1989 – 2019)</w:t>
+      </w:r>
+    </w:p>
+    <w:tbl>
+      <w:tblPr>
+        <w:tblStyle w:val="TableGrid"/>
+        <w:tblW w:w="0" w:type="auto"/>
+        <w:tblInd w:w="37" w:type="dxa"/>
+        <w:tblLook w:val="04A0" w:firstRow="1" w:lastRow="0" w:firstColumn="1" w:lastColumn="0" w:noHBand="0" w:noVBand="1"/>
+      </w:tblPr>
+      <w:tblGrid>
+        <w:gridCol w:w="4371"/>
+        <w:gridCol w:w="4374"/>
+      </w:tblGrid>
+      <w:tr>
+        <w:tc>
+          <w:tcPr>
+            <w:tcW w:w="4391" w:type="dxa"/>
+          </w:tcPr>
+          <w:p>
+            <w:pPr>
+              <w:pStyle w:val="Heading1"/>
+              <w:tabs>
+                <w:tab w:val="left" w:pos="745"/>
+              </w:tabs>
+              <w:ind w:left="0" w:firstLine="0"/>
+              <w:rPr>
+                <w:rFonts w:ascii="Times New Roman" w:hAnsi="Times New Roman" w:cs="Times New Roman"/>
+                <w:i w:val="0"/>
+                <w:iCs w:val="0"/>
+                <w:sz w:val="22"/>
+                <w:szCs w:val="22"/>
+              </w:rPr>
+            </w:pPr>
+            <w:r>
+              <w:rPr>
+                <w:rFonts w:ascii="Times New Roman" w:hAnsi="Times New Roman" w:cs="Times New Roman"/>
+                <w:i w:val="0"/>
+                <w:iCs w:val="0"/>
+                <w:sz w:val="22"/>
+                <w:szCs w:val="22"/>
+              </w:rPr>
+              <w:t>Year</w:t>
+            </w:r>
+          </w:p>
+        </w:tc>
+        <w:tc>
+          <w:tcPr>
+            <w:tcW w:w="4391" w:type="dxa"/>
+          </w:tcPr>
+          <w:p>
+            <w:pPr>
+              <w:pStyle w:val="Heading1"/>
+              <w:tabs>
+                <w:tab w:val="left" w:pos="745"/>
+              </w:tabs>
+              <w:ind w:left="0" w:firstLine="0"/>
+              <w:rPr>
+                <w:rFonts w:ascii="Times New Roman" w:hAnsi="Times New Roman" w:cs="Times New Roman"/>
+                <w:i w:val="0"/>
+                <w:iCs w:val="0"/>
+                <w:sz w:val="22"/>
+                <w:szCs w:val="22"/>
+              </w:rPr>
+            </w:pPr>
+            <w:r>
+              <w:rPr>
+                <w:rFonts w:ascii="Times New Roman" w:hAnsi="Times New Roman" w:cs="Times New Roman"/>
+                <w:i w:val="0"/>
+                <w:iCs w:val="0"/>
+                <w:sz w:val="22"/>
+                <w:szCs w:val="22"/>
+              </w:rPr>
+              <w:t>Agricultural Labour (Mainland Portugal)</w:t>
+            </w:r>
+          </w:p>
+        </w:tc>
+      </w:tr>
+      <w:tr>
+        <w:tc>
+          <w:tcPr>
+            <w:tcW w:w="4391" w:type="dxa"/>
+          </w:tcPr>
+          <w:p>
+            <w:pPr>
+              <w:pStyle w:val="Heading1"/>
+              <w:tabs>
+                <w:tab w:val="left" w:pos="745"/>
+              </w:tabs>
+              <w:ind w:left="0" w:firstLine="0"/>
+              <w:rPr>
+                <w:rFonts w:ascii="Times New Roman" w:hAnsi="Times New Roman" w:cs="Times New Roman"/>
+                <w:i w:val="0"/>
+                <w:iCs w:val="0"/>
+                <w:sz w:val="22"/>
+                <w:szCs w:val="22"/>
+              </w:rPr>
+            </w:pPr>
+            <w:r>
+              <w:rPr>
+                <w:rFonts w:ascii="Times New Roman" w:hAnsi="Times New Roman" w:cs="Times New Roman"/>
+                <w:i w:val="0"/>
+                <w:iCs w:val="0"/>
+                <w:sz w:val="22"/>
+                <w:szCs w:val="22"/>
+              </w:rPr>
+              <w:t>1989</w:t>
+            </w:r>
+          </w:p>
+        </w:tc>
+        <w:tc>
+          <w:tcPr>
+            <w:tcW w:w="4391" w:type="dxa"/>
+          </w:tcPr>
+          <w:p>
+            <w:pPr>
+              <w:pStyle w:val="Heading1"/>
+              <w:tabs>
+                <w:tab w:val="left" w:pos="745"/>
+              </w:tabs>
+              <w:ind w:left="0" w:firstLine="0"/>
+              <w:rPr>
+                <w:rFonts w:ascii="Times New Roman" w:hAnsi="Times New Roman" w:cs="Times New Roman"/>
+                <w:i w:val="0"/>
+                <w:iCs w:val="0"/>
+                <w:sz w:val="22"/>
+                <w:szCs w:val="22"/>
+              </w:rPr>
+            </w:pPr>
+            <w:r>
+              <w:rPr>
+                <w:rFonts w:ascii="Times New Roman" w:hAnsi="Times New Roman" w:cs="Times New Roman"/>
+                <w:i w:val="0"/>
+                <w:iCs w:val="0"/>
+                <w:sz w:val="22"/>
+                <w:szCs w:val="22"/>
+              </w:rPr>
+              <w:t>1,449,906</w:t>
+            </w:r>
+          </w:p>
+        </w:tc>
+      </w:tr>
+      <w:tr>
+        <w:tc>
+          <w:tcPr>
+            <w:tcW w:w="4391" w:type="dxa"/>
+          </w:tcPr>
+          <w:p>
+            <w:pPr>
+              <w:pStyle w:val="Heading1"/>
+              <w:tabs>
+                <w:tab w:val="left" w:pos="745"/>
+              </w:tabs>
+              <w:ind w:left="0" w:firstLine="0"/>
+              <w:rPr>
+                <w:rFonts w:ascii="Times New Roman" w:hAnsi="Times New Roman" w:cs="Times New Roman"/>
+                <w:i w:val="0"/>
+                <w:iCs w:val="0"/>
+                <w:sz w:val="22"/>
+                <w:szCs w:val="22"/>
+              </w:rPr>
+            </w:pPr>
+            <w:r>
+              <w:rPr>
+                <w:rFonts w:ascii="Times New Roman" w:hAnsi="Times New Roman" w:cs="Times New Roman"/>
+                <w:i w:val="0"/>
+                <w:iCs w:val="0"/>
+                <w:sz w:val="22"/>
+                <w:szCs w:val="22"/>
+              </w:rPr>
+              <w:t>1999</w:t>
+            </w:r>
+          </w:p>
+        </w:tc>
+        <w:tc>
+          <w:tcPr>
+            <w:tcW w:w="4391" w:type="dxa"/>
+          </w:tcPr>
+          <w:p>
+            <w:pPr>
+              <w:pStyle w:val="Heading1"/>
+              <w:tabs>
+                <w:tab w:val="left" w:pos="745"/>
+              </w:tabs>
+              <w:ind w:left="0" w:firstLine="0"/>
+              <w:rPr>
+                <w:rFonts w:ascii="Times New Roman" w:hAnsi="Times New Roman" w:cs="Times New Roman"/>
+                <w:i w:val="0"/>
+                <w:iCs w:val="0"/>
+                <w:sz w:val="22"/>
+                <w:szCs w:val="22"/>
+              </w:rPr>
+            </w:pPr>
+            <w:r>
+              <w:rPr>
+                <w:rFonts w:ascii="Times New Roman" w:hAnsi="Times New Roman" w:cs="Times New Roman"/>
+                <w:i w:val="0"/>
+                <w:iCs w:val="0"/>
+                <w:sz w:val="22"/>
+                <w:szCs w:val="22"/>
+              </w:rPr>
+              <w:t>1,002,480</w:t>
+            </w:r>
+          </w:p>
+        </w:tc>
+      </w:tr>
+      <w:tr>
+        <w:tc>
+          <w:tcPr>
+            <w:tcW w:w="4391" w:type="dxa"/>
+          </w:tcPr>
+          <w:p>
+            <w:pPr>
+              <w:pStyle w:val="Heading1"/>
+              <w:tabs>
+                <w:tab w:val="left" w:pos="745"/>
+              </w:tabs>
+              <w:ind w:left="0" w:firstLine="0"/>
+              <w:rPr>
+                <w:rFonts w:ascii="Times New Roman" w:hAnsi="Times New Roman" w:cs="Times New Roman"/>
+                <w:i w:val="0"/>
+                <w:iCs w:val="0"/>
+                <w:sz w:val="22"/>
+                <w:szCs w:val="22"/>
+              </w:rPr>
+            </w:pPr>
+            <w:r>
+              <w:rPr>
+                <w:rFonts w:ascii="Times New Roman" w:hAnsi="Times New Roman" w:cs="Times New Roman"/>
+                <w:i w:val="0"/>
+                <w:iCs w:val="0"/>
+                <w:sz w:val="22"/>
+                <w:szCs w:val="22"/>
+              </w:rPr>
+              <w:t>2009</w:t>
+            </w:r>
+          </w:p>
+        </w:tc>
+        <w:tc>
+          <w:tcPr>
+            <w:tcW w:w="4391" w:type="dxa"/>
+          </w:tcPr>
+          <w:p>
+            <w:pPr>
+              <w:pStyle w:val="Heading1"/>
+              <w:tabs>
+                <w:tab w:val="left" w:pos="745"/>
+              </w:tabs>
+              <w:ind w:left="0" w:firstLine="0"/>
+              <w:rPr>
+                <w:rFonts w:ascii="Times New Roman" w:hAnsi="Times New Roman" w:cs="Times New Roman"/>
+                <w:i w:val="0"/>
+                <w:iCs w:val="0"/>
+                <w:sz w:val="22"/>
+                <w:szCs w:val="22"/>
+              </w:rPr>
+            </w:pPr>
+            <w:r>
+              <w:rPr>
+                <w:rFonts w:ascii="Times New Roman" w:hAnsi="Times New Roman" w:cs="Times New Roman"/>
+                <w:i w:val="0"/>
+                <w:iCs w:val="0"/>
+                <w:sz w:val="22"/>
+                <w:szCs w:val="22"/>
+              </w:rPr>
+              <w:t>649,607</w:t>
+            </w:r>
+          </w:p>
+        </w:tc>
+      </w:tr>
+      <w:tr>
+        <w:tc>
+          <w:tcPr>
+            <w:tcW w:w="4391" w:type="dxa"/>
+          </w:tcPr>
+          <w:p>
+            <w:pPr>
+              <w:pStyle w:val="Heading1"/>
+              <w:tabs>
+                <w:tab w:val="left" w:pos="745"/>
+              </w:tabs>
+              <w:ind w:left="0" w:firstLine="0"/>
+              <w:rPr>
+                <w:rFonts w:ascii="Times New Roman" w:hAnsi="Times New Roman" w:cs="Times New Roman"/>
+                <w:i w:val="0"/>
+                <w:iCs w:val="0"/>
+                <w:sz w:val="22"/>
+                <w:szCs w:val="22"/>
+              </w:rPr>
+            </w:pPr>
+            <w:r>
+              <w:rPr>
+                <w:rFonts w:ascii="Times New Roman" w:hAnsi="Times New Roman" w:cs="Times New Roman"/>
+                <w:i w:val="0"/>
+                <w:iCs w:val="0"/>
+                <w:sz w:val="22"/>
+                <w:szCs w:val="22"/>
+              </w:rPr>
+              <w:t>2019</w:t>
+            </w:r>
+          </w:p>
+        </w:tc>
+        <w:tc>
+          <w:tcPr>
+            <w:tcW w:w="4391" w:type="dxa"/>
+          </w:tcPr>
+          <w:p>
+            <w:pPr>
+              <w:pStyle w:val="Heading1"/>
+              <w:tabs>
+                <w:tab w:val="left" w:pos="745"/>
+              </w:tabs>
+              <w:ind w:left="0" w:firstLine="0"/>
+              <w:rPr>
+                <w:rFonts w:ascii="Times New Roman" w:hAnsi="Times New Roman" w:cs="Times New Roman"/>
+                <w:i w:val="0"/>
+                <w:iCs w:val="0"/>
+                <w:sz w:val="22"/>
+                <w:szCs w:val="22"/>
+              </w:rPr>
+            </w:pPr>
+            <w:r>
+              <w:rPr>
+                <w:rFonts w:ascii="Times New Roman" w:hAnsi="Times New Roman" w:cs="Times New Roman"/>
+                <w:i w:val="0"/>
+                <w:iCs w:val="0"/>
+                <w:sz w:val="22"/>
+                <w:szCs w:val="22"/>
+              </w:rPr>
+              <w:t>596,938</w:t>
+            </w:r>
+          </w:p>
+        </w:tc>
+      </w:tr>
+    </w:tbl>
+    <w:p>
+      <w:pPr>
+        <w:pStyle w:val="Heading1"/>
+        <w:tabs>
+          <w:tab w:val="left" w:pos="745"/>
+        </w:tabs>
+        <w:ind w:left="37" w:firstLine="0"/>
+        <w:rPr>
+          <w:rFonts w:ascii="Times New Roman" w:hAnsi="Times New Roman" w:cs="Times New Roman"/>
+          <w:i w:val="0"/>
+          <w:iCs w:val="0"/>
+          <w:sz w:val="16"/>
+          <w:szCs w:val="16"/>
+        </w:rPr>
+      </w:pPr>
+      <w:r>
+        <w:rPr>
+          <w:rFonts w:ascii="Times New Roman" w:hAnsi="Times New Roman" w:cs="Times New Roman"/>
+          <w:i w:val="0"/>
+          <w:iCs w:val="0"/>
+          <w:sz w:val="16"/>
+          <w:szCs w:val="16"/>
+        </w:rPr>
+        <w:t>Source: INE – Agricultural labour by geographic location (NUTS 2013), type of labour and work duration regime. Values for “Continente” (code 1).</w:t>
+      </w:r>
+    </w:p>
+    <w:p>
+      <w:pPr>
+        <w:pStyle w:val="Heading1"/>
+        <w:tabs>
+          <w:tab w:val="left" w:pos="745"/>
+        </w:tabs>
+        <w:ind w:left="37" w:firstLine="0"/>
+        <w:rPr>
+          <w:rFonts w:ascii="Times New Roman" w:hAnsi="Times New Roman" w:cs="Times New Roman"/>
+          <w:i w:val="0"/>
+          <w:iCs w:val="0"/>
+          <w:sz w:val="16"/>
+          <w:szCs w:val="16"/>
+        </w:rPr>
+      </w:pPr>
+    </w:p>
+    <w:p>
+      <w:pPr>
+        <w:pStyle w:val="Heading1"/>
+        <w:tabs>
+          <w:tab w:val="left" w:pos="745"/>
+        </w:tabs>
+        <w:ind w:left="37" w:firstLine="0"/>
+        <w:rPr>
+          <w:rFonts w:ascii="Times New Roman" w:hAnsi="Times New Roman" w:cs="Times New Roman"/>
+          <w:i w:val="0"/>
+          <w:iCs w:val="0"/>
+          <w:sz w:val="22"/>
+          <w:szCs w:val="22"/>
+        </w:rPr>
+      </w:pPr>
+      <w:r>
+        <w:rPr>
+          <w:rFonts w:ascii="Times New Roman" w:hAnsi="Times New Roman" w:cs="Times New Roman"/>
+          <w:i w:val="0"/>
+          <w:iCs w:val="0"/>
+          <w:sz w:val="22"/>
+          <w:szCs w:val="22"/>
+        </w:rPr>
+        <w:t>From this table it is apparent that approximately 1.45 million people were employed in agricultural activities in the mainland in 1989. Over the last 30-year period this number fell to just under 597,000 – a reduction of approximately 59%. For better reference, Figure 3.1 illustrates the difference between the years.</w:t>
+      </w:r>
+    </w:p>
+    <w:p>
+      <w:pPr>
+        <w:pStyle w:val="Heading1"/>
+        <w:tabs>
+          <w:tab w:val="left" w:pos="745"/>
+        </w:tabs>
+        <w:ind w:left="37" w:firstLine="0"/>
+        <w:rPr>
+          <w:rFonts w:ascii="Times New Roman" w:hAnsi="Times New Roman" w:cs="Times New Roman"/>
+          <w:i w:val="0"/>
+          <w:iCs w:val="0"/>
+          <w:sz w:val="22"/>
+          <w:szCs w:val="22"/>
+        </w:rPr>
+      </w:pPr>
+    </w:p>
+    <w:p>
+      <w:pPr>
+        <w:pStyle w:val="Heading1"/>
+        <w:tabs>
+          <w:tab w:val="left" w:pos="745"/>
+        </w:tabs>
+        <w:rPr>
+          <w:rFonts w:ascii="Times New Roman" w:hAnsi="Times New Roman" w:cs="Times New Roman"/>
+          <w:i w:val="0"/>
+          <w:iCs w:val="0"/>
+          <w:sz w:val="22"/>
+          <w:szCs w:val="22"/>
+        </w:rPr>
+      </w:pPr>
+      <w:r>
+        <w:rPr>
+          <w:rFonts w:ascii="Times New Roman" w:hAnsi="Times New Roman" w:cs="Times New Roman"/>
+          <w:i w:val="0"/>
+          <w:iCs w:val="0"/>
+          <w:sz w:val="22"/>
+          <w:szCs w:val="22"/>
+        </w:rPr>
+        <w:t>Figure 3.1 – Evolution of agricultural labour in mainland Portugal (1989 – 2019)</w:t>
+      </w:r>
+    </w:p>
+    <w:p>
+      <w:pPr>
+        <w:pStyle w:val="Heading1"/>
+        <w:tabs>
+          <w:tab w:val="left" w:pos="745"/>
+        </w:tabs>
+        <w:ind w:left="37" w:firstLine="0"/>
+        <w:rPr>
+          <w:rFonts w:ascii="Times New Roman" w:hAnsi="Times New Roman" w:cs="Times New Roman"/>
+          <w:i w:val="0"/>
+          <w:iCs w:val="0"/>
+          <w:sz w:val="22"/>
+          <w:szCs w:val="22"/>
+        </w:rPr>
+      </w:pPr>
+      <w:r>
+        <w:rPr>
+          <w:rFonts w:ascii="Times New Roman" w:hAnsi="Times New Roman" w:cs="Times New Roman"/>
+          <w:i w:val="0"/>
+          <w:iCs w:val="0"/>
+          <w:noProof/>
+          <w:sz w:val="22"/>
+          <w:szCs w:val="22"/>
+        </w:rPr>
+        <w:drawing>
+          <wp:inline distT="0" distB="0" distL="0" distR="0" wp14:anchorId="6CBC5351" wp14:editId="0FD547A2">
+            <wp:extent cx="5486400" cy="3200400"/>
+            <wp:effectExtent l="0" t="0" r="0" b="0"/>
+            <wp:docPr id="1319598588" name="Chart 3"/>
+            <wp:cNvGraphicFramePr/>
+            <a:graphic xmlns:a="http://schemas.openxmlformats.org/drawingml/2006/main">
+              <a:graphicData uri="http://schemas.openxmlformats.org/drawingml/2006/chart">
+                <c:chart xmlns:c="http://schemas.openxmlformats.org/drawingml/2006/chart" xmlns:r="http://schemas.openxmlformats.org/officeDocument/2006/relationships" r:id="rId9"/>
+              </a:graphicData>
+            </a:graphic>
+          </wp:inline>
+        </w:drawing>
+      </w:r>
+    </w:p>
+    <w:p>
+      <w:pPr>
+        <w:pStyle w:val="ds-markdown-paragraph"/>
+        <w:shd w:val="clear" w:color="auto" w:fill="FFFFFF"/>
+        <w:spacing w:before="240" w:beforeAutospacing="0" w:after="240" w:afterAutospacing="0"/>
+        <w:rPr>
+          <w:color w:val="0F1115"/>
+          <w:sz w:val="22"/>
+          <w:szCs w:val="22"/>
+        </w:rPr>
+      </w:pPr>
+    </w:p>
+    <w:p>
+      <w:pPr>
+        <w:pStyle w:val="ds-markdown-paragraph"/>
+        <w:shd w:val="clear" w:color="auto" w:fill="FFFFFF"/>
+        <w:spacing w:before="240" w:beforeAutospacing="0" w:after="240" w:afterAutospacing="0"/>
+        <w:rPr>
+          <w:color w:val="0F1115"/>
+          <w:sz w:val="22"/>
+          <w:szCs w:val="22"/>
+        </w:rPr>
+      </w:pPr>
+    </w:p>
+    <w:p>
+      <w:pPr>
+        <w:pStyle w:val="ds-markdown-paragraph"/>
+        <w:shd w:val="clear" w:color="auto" w:fill="FFFFFF"/>
+        <w:spacing w:before="240" w:beforeAutospacing="0" w:after="240" w:afterAutospacing="0"/>
+        <w:rPr>
+          <w:color w:val="0F1115"/>
+          <w:sz w:val="22"/>
+          <w:szCs w:val="22"/>
+        </w:rPr>
+      </w:pPr>
+      <w:r>
+        <w:rPr>
+          <w:color w:val="0F1115"/>
+          <w:sz w:val="22"/>
+          <w:szCs w:val="22"/>
+        </w:rPr>
+        <w:t>Three key observations stand out:</w:t>
+      </w:r>
+    </w:p>
+    <w:p>
+      <w:pPr>
+        <w:pStyle w:val="ds-markdown-paragraph"/>
+        <w:numPr>
+          <w:ilvl w:val="0"/>
+          <w:numId w:val="9"/>
+        </w:numPr>
+        <w:shd w:val="clear" w:color="auto" w:fill="FFFFFF"/>
+        <w:spacing w:before="0" w:beforeAutospacing="0" w:after="0" w:afterAutospacing="0"/>
+        <w:rPr>
+          <w:color w:val="0F1115"/>
+          <w:sz w:val="22"/>
+          <w:szCs w:val="22"/>
+        </w:rPr>
+      </w:pPr>
+      <w:r>
+        <w:rPr>
+          <w:rStyle w:val="Strong"/>
+          <w:b w:val="0"/>
+          <w:bCs w:val="0"/>
+          <w:color w:val="0F1115"/>
+          <w:sz w:val="22"/>
+          <w:szCs w:val="22"/>
+        </w:rPr>
+        <w:t>Steep initial decline (1989–1999):</w:t>
+      </w:r>
+      <w:r>
+        <w:rPr>
+          <w:color w:val="0F1115"/>
+          <w:sz w:val="22"/>
+          <w:szCs w:val="22"/>
+        </w:rPr>
+        <w:t> The loss of nearly 450,000 workers in the first decade reflects a period of intense rural exodus, mechanization, and the abandonment of small, non-viable farms following Portugal's integration into the European Economic Community (now EU) in 1986.</w:t>
+      </w:r>
+    </w:p>
+    <w:p>
+      <w:pPr>
+        <w:pStyle w:val="ds-markdown-paragraph"/>
+        <w:numPr>
+          <w:ilvl w:val="0"/>
+          <w:numId w:val="9"/>
+        </w:numPr>
+        <w:shd w:val="clear" w:color="auto" w:fill="FFFFFF"/>
+        <w:spacing w:before="0" w:beforeAutospacing="0" w:after="0" w:afterAutospacing="0"/>
+        <w:rPr>
+          <w:color w:val="0F1115"/>
+          <w:sz w:val="22"/>
+          <w:szCs w:val="22"/>
+        </w:rPr>
+      </w:pPr>
+      <w:r>
+        <w:rPr>
+          <w:rStyle w:val="Strong"/>
+          <w:b w:val="0"/>
+          <w:bCs w:val="0"/>
+          <w:color w:val="0F1115"/>
+          <w:sz w:val="22"/>
+          <w:szCs w:val="22"/>
+        </w:rPr>
+        <w:t>Continued but slower decline (1999–2009):</w:t>
+      </w:r>
+      <w:r>
+        <w:rPr>
+          <w:color w:val="0F1115"/>
+          <w:sz w:val="22"/>
+          <w:szCs w:val="22"/>
+        </w:rPr>
+        <w:t> The reduction of another 350,000 workers suggests that restructuring continued, though possibly at a more moderate pace as the agricultural sector adapted to EU policies, including the Common Agricultural Policy (CAP).</w:t>
+      </w:r>
+    </w:p>
+    <w:p>
+      <w:pPr>
+        <w:pStyle w:val="ds-markdown-paragraph"/>
+        <w:numPr>
+          <w:ilvl w:val="0"/>
+          <w:numId w:val="9"/>
+        </w:numPr>
+        <w:shd w:val="clear" w:color="auto" w:fill="FFFFFF"/>
+        <w:spacing w:before="0" w:beforeAutospacing="0" w:after="0" w:afterAutospacing="0"/>
+        <w:rPr>
+          <w:color w:val="0F1115"/>
+          <w:sz w:val="22"/>
+          <w:szCs w:val="22"/>
+        </w:rPr>
+      </w:pPr>
+      <w:r>
+        <w:rPr>
+          <w:rStyle w:val="Strong"/>
+          <w:b w:val="0"/>
+          <w:bCs w:val="0"/>
+          <w:color w:val="0F1115"/>
+          <w:sz w:val="22"/>
+          <w:szCs w:val="22"/>
+        </w:rPr>
+        <w:t>Moderation of decline (2009–2019):</w:t>
+      </w:r>
+      <w:r>
+        <w:rPr>
+          <w:color w:val="0F1115"/>
+          <w:sz w:val="22"/>
+          <w:szCs w:val="22"/>
+        </w:rPr>
+        <w:t> The sharp reduction in the rate of decline (only 52,669 workers lost) suggests that the agricultural labour force may be approaching a lower baseline. This remaining workforce likely consists of more specialized, full-time, and professional farmers.</w:t>
+      </w:r>
+    </w:p>
+    <w:p>
+      <w:pPr>
+        <w:pStyle w:val="ds-markdown-paragraph"/>
+        <w:shd w:val="clear" w:color="auto" w:fill="FFFFFF"/>
+        <w:spacing w:before="240" w:beforeAutospacing="0" w:after="240" w:afterAutospacing="0"/>
+        <w:rPr>
+          <w:color w:val="0F1115"/>
+          <w:sz w:val="22"/>
+          <w:szCs w:val="22"/>
+        </w:rPr>
+      </w:pPr>
+      <w:r>
+        <w:rPr>
+          <w:color w:val="0F1115"/>
+          <w:sz w:val="22"/>
+          <w:szCs w:val="22"/>
+        </w:rPr>
+        <w:t>Overall, these patterns are consistent with a process of </w:t>
+      </w:r>
+      <w:r>
+        <w:rPr>
+          <w:rStyle w:val="Strong"/>
+          <w:b w:val="0"/>
+          <w:bCs w:val="0"/>
+          <w:color w:val="0F1115"/>
+          <w:sz w:val="22"/>
+          <w:szCs w:val="22"/>
+        </w:rPr>
+        <w:t>agricultural restructuring</w:t>
+      </w:r>
+      <w:r>
+        <w:rPr>
+          <w:color w:val="0F1115"/>
+          <w:sz w:val="22"/>
+          <w:szCs w:val="22"/>
+        </w:rPr>
+        <w:t>, where fewer workers are needed to manage larger, more mechanized, and more capital-intensive farms. The slowing rate of decline after 2009 may also reflect stabilization of the sector after decades of transformation.</w:t>
+      </w:r>
+    </w:p>
+    <w:p>
+      <w:pPr>
+        <w:pStyle w:val="BodyText"/>
+        <w:spacing w:before="26"/>
+      </w:pPr>
+    </w:p>
+    <w:p>
+      <w:pPr>
+        <w:pStyle w:val="Heading1"/>
+        <w:numPr>
+          <w:ilvl w:val="1"/>
+          <w:numId w:val="2"/>
+        </w:numPr>
+        <w:tabs>
+          <w:tab w:val="left" w:pos="745"/>
+        </w:tabs>
+      </w:pPr>
+      <w:r>
+        <w:t>Changes in agricultural area / land use</w:t>
+      </w:r>
+    </w:p>
+    <w:p>
+      <w:pPr>
+        <w:pStyle w:val="Heading1"/>
+        <w:tabs>
+          <w:tab w:val="left" w:pos="745"/>
+        </w:tabs>
+        <w:ind w:left="37" w:firstLine="0"/>
+        <w:rPr>
+          <w:rFonts w:ascii="Times New Roman" w:hAnsi="Times New Roman" w:cs="Times New Roman"/>
+          <w:i w:val="0"/>
+          <w:iCs w:val="0"/>
+          <w:sz w:val="22"/>
+          <w:szCs w:val="22"/>
+        </w:rPr>
+      </w:pPr>
+      <w:r>
+        <w:rPr>
+          <w:rFonts w:ascii="Times New Roman" w:hAnsi="Times New Roman" w:cs="Times New Roman"/>
+          <w:i w:val="0"/>
+          <w:iCs w:val="0"/>
+          <w:sz w:val="22"/>
+          <w:szCs w:val="22"/>
+        </w:rPr>
+        <w:t>Beyond the decline in agricultural labour, understanding how agricultural land use evolved is essential for characterizing the restructuring process. This section examines changes in total agricultural area, temporary crop holdings, permanent crop holdings, and the relationship between these different land use categories between 1989 and 2019.</w:t>
+      </w:r>
+    </w:p>
+    <w:p>
+      <w:pPr>
+        <w:pStyle w:val="Heading1"/>
+        <w:tabs>
+          <w:tab w:val="left" w:pos="745"/>
+        </w:tabs>
+        <w:ind w:left="37" w:firstLine="0"/>
+        <w:rPr>
+          <w:rFonts w:ascii="Times New Roman" w:hAnsi="Times New Roman" w:cs="Times New Roman"/>
+          <w:i w:val="0"/>
+          <w:iCs w:val="0"/>
+          <w:sz w:val="22"/>
+          <w:szCs w:val="22"/>
+        </w:rPr>
+      </w:pPr>
+    </w:p>
+    <w:p>
+      <w:pPr>
+        <w:pStyle w:val="Heading1"/>
+        <w:tabs>
+          <w:tab w:val="left" w:pos="745"/>
+        </w:tabs>
+        <w:ind w:left="37" w:firstLine="0"/>
+        <w:rPr>
+          <w:spacing w:val="-2"/>
+        </w:rPr>
+      </w:pPr>
+      <w:r>
+        <w:rPr>
+          <w:spacing w:val="-2"/>
+        </w:rPr>
+        <w:t>3.2.1 Evolution of Total Agricultural Area</w:t>
+      </w:r>
+    </w:p>
+    <w:p>
+      <w:pPr>
+        <w:pStyle w:val="Heading1"/>
+        <w:tabs>
+          <w:tab w:val="left" w:pos="745"/>
+        </w:tabs>
+        <w:ind w:left="37" w:firstLine="0"/>
+        <w:rPr>
+          <w:rFonts w:ascii="Times New Roman" w:hAnsi="Times New Roman" w:cs="Times New Roman"/>
+          <w:i w:val="0"/>
+          <w:iCs w:val="0"/>
+          <w:spacing w:val="-2"/>
+          <w:sz w:val="22"/>
+          <w:szCs w:val="22"/>
+        </w:rPr>
+      </w:pPr>
+      <w:r>
+        <w:rPr>
+          <w:rFonts w:ascii="Times New Roman" w:hAnsi="Times New Roman" w:cs="Times New Roman"/>
+          <w:i w:val="0"/>
+          <w:iCs w:val="0"/>
+          <w:spacing w:val="-2"/>
+          <w:sz w:val="22"/>
+          <w:szCs w:val="22"/>
+        </w:rPr>
+        <w:t>Contrary to the sharp decline observed in agricultural labour, total agricultural area in mainland Portugal remained relatively stable over the 30-year period. Table 3.3 presents the evolution of the total agricultural holdings area between 1989 and 2019.</w:t>
+      </w:r>
+    </w:p>
+    <w:p>
+      <w:pPr>
+        <w:pStyle w:val="Heading1"/>
+        <w:tabs>
+          <w:tab w:val="left" w:pos="745"/>
+        </w:tabs>
+        <w:ind w:left="37" w:firstLine="0"/>
+        <w:rPr>
+          <w:rFonts w:ascii="Times New Roman" w:hAnsi="Times New Roman" w:cs="Times New Roman"/>
+          <w:i w:val="0"/>
+          <w:iCs w:val="0"/>
+          <w:sz w:val="22"/>
+          <w:szCs w:val="22"/>
+        </w:rPr>
+      </w:pPr>
+    </w:p>
+    <w:p>
+      <w:pPr>
+        <w:pStyle w:val="Heading1"/>
+        <w:tabs>
+          <w:tab w:val="left" w:pos="745"/>
+        </w:tabs>
+        <w:ind w:left="37" w:firstLine="0"/>
+        <w:rPr>
+          <w:rFonts w:ascii="Times New Roman" w:hAnsi="Times New Roman" w:cs="Times New Roman"/>
+          <w:i w:val="0"/>
+          <w:iCs w:val="0"/>
+          <w:spacing w:val="-2"/>
+          <w:sz w:val="22"/>
+          <w:szCs w:val="22"/>
+        </w:rPr>
+      </w:pPr>
+      <w:r>
+        <w:rPr>
+          <w:rFonts w:ascii="Times New Roman" w:hAnsi="Times New Roman" w:cs="Times New Roman"/>
+          <w:i w:val="0"/>
+          <w:iCs w:val="0"/>
+          <w:spacing w:val="-2"/>
+          <w:sz w:val="22"/>
+          <w:szCs w:val="22"/>
+        </w:rPr>
+        <w:t xml:space="preserve">Table 3.1 </w:t>
+      </w:r>
+      <w:r>
+        <w:rPr>
+          <w:rFonts w:ascii="Times New Roman" w:hAnsi="Times New Roman" w:cs="Times New Roman"/>
+          <w:i w:val="0"/>
+          <w:iCs w:val="0"/>
+          <w:spacing w:val="-2"/>
+          <w:sz w:val="22"/>
+          <w:szCs w:val="22"/>
+        </w:rPr>
+        <w:t>–</w:t>
+      </w:r>
+      <w:r>
+        <w:rPr>
+          <w:rFonts w:ascii="Times New Roman" w:hAnsi="Times New Roman" w:cs="Times New Roman"/>
+          <w:i w:val="0"/>
+          <w:iCs w:val="0"/>
+          <w:spacing w:val="-2"/>
+          <w:sz w:val="22"/>
+          <w:szCs w:val="22"/>
+        </w:rPr>
+        <w:t xml:space="preserve"> </w:t>
+      </w:r>
+      <w:r>
+        <w:rPr>
+          <w:rFonts w:ascii="Times New Roman" w:hAnsi="Times New Roman" w:cs="Times New Roman"/>
+          <w:i w:val="0"/>
+          <w:iCs w:val="0"/>
+          <w:spacing w:val="-2"/>
+          <w:sz w:val="22"/>
+          <w:szCs w:val="22"/>
+        </w:rPr>
+        <w:t>Total Agricultural Holdings Area in Mainland Portugal (1989 – 2019)</w:t>
+      </w:r>
+    </w:p>
+    <w:tbl>
+      <w:tblPr>
+        <w:tblStyle w:val="TableGrid"/>
+        <w:tblW w:w="0" w:type="auto"/>
+        <w:tblInd w:w="37" w:type="dxa"/>
+        <w:tblLook w:val="04A0" w:firstRow="1" w:lastRow="0" w:firstColumn="1" w:lastColumn="0" w:noHBand="0" w:noVBand="1"/>
+      </w:tblPr>
+      <w:tblGrid>
+        <w:gridCol w:w="4371"/>
+        <w:gridCol w:w="4374"/>
+      </w:tblGrid>
+      <w:tr>
+        <w:tc>
+          <w:tcPr>
+            <w:tcW w:w="4371" w:type="dxa"/>
+          </w:tcPr>
+          <w:p>
+            <w:pPr>
+              <w:pStyle w:val="Heading1"/>
+              <w:tabs>
+                <w:tab w:val="left" w:pos="745"/>
+              </w:tabs>
+              <w:ind w:left="0" w:firstLine="0"/>
+              <w:rPr>
+                <w:rFonts w:ascii="Times New Roman" w:hAnsi="Times New Roman" w:cs="Times New Roman"/>
+                <w:i w:val="0"/>
+                <w:iCs w:val="0"/>
+                <w:spacing w:val="-2"/>
+                <w:sz w:val="22"/>
+                <w:szCs w:val="22"/>
+              </w:rPr>
+            </w:pPr>
+            <w:r>
+              <w:rPr>
+                <w:rFonts w:ascii="Times New Roman" w:hAnsi="Times New Roman" w:cs="Times New Roman"/>
+                <w:i w:val="0"/>
+                <w:iCs w:val="0"/>
+                <w:spacing w:val="-2"/>
+                <w:sz w:val="22"/>
+                <w:szCs w:val="22"/>
+              </w:rPr>
+              <w:t>Year</w:t>
+            </w:r>
+          </w:p>
+        </w:tc>
+        <w:tc>
+          <w:tcPr>
+            <w:tcW w:w="4374" w:type="dxa"/>
+          </w:tcPr>
+          <w:p>
+            <w:pPr>
+              <w:pStyle w:val="Heading1"/>
+              <w:tabs>
+                <w:tab w:val="left" w:pos="745"/>
+              </w:tabs>
+              <w:ind w:left="0" w:firstLine="0"/>
+              <w:rPr>
+                <w:rFonts w:ascii="Times New Roman" w:hAnsi="Times New Roman" w:cs="Times New Roman"/>
+                <w:i w:val="0"/>
+                <w:iCs w:val="0"/>
+                <w:spacing w:val="-2"/>
+                <w:sz w:val="22"/>
+                <w:szCs w:val="22"/>
+              </w:rPr>
+            </w:pPr>
+            <w:r>
+              <w:rPr>
+                <w:rFonts w:ascii="Times New Roman" w:hAnsi="Times New Roman" w:cs="Times New Roman"/>
+                <w:i w:val="0"/>
+                <w:iCs w:val="0"/>
+                <w:spacing w:val="-2"/>
+                <w:sz w:val="22"/>
+                <w:szCs w:val="22"/>
+              </w:rPr>
+              <w:t>Agricultural Holdings Area (ha)</w:t>
+            </w:r>
+          </w:p>
+        </w:tc>
+      </w:tr>
+      <w:tr>
+        <w:tc>
+          <w:tcPr>
+            <w:tcW w:w="4371" w:type="dxa"/>
+          </w:tcPr>
+          <w:p>
+            <w:pPr>
+              <w:pStyle w:val="Heading1"/>
+              <w:tabs>
+                <w:tab w:val="left" w:pos="745"/>
+              </w:tabs>
+              <w:ind w:left="0" w:firstLine="0"/>
+              <w:rPr>
+                <w:rFonts w:ascii="Times New Roman" w:hAnsi="Times New Roman" w:cs="Times New Roman"/>
+                <w:i w:val="0"/>
+                <w:iCs w:val="0"/>
+                <w:spacing w:val="-2"/>
+                <w:sz w:val="22"/>
+                <w:szCs w:val="22"/>
+              </w:rPr>
+            </w:pPr>
+            <w:r>
+              <w:rPr>
+                <w:rFonts w:ascii="Times New Roman" w:hAnsi="Times New Roman" w:cs="Times New Roman"/>
+                <w:i w:val="0"/>
+                <w:iCs w:val="0"/>
+                <w:spacing w:val="-2"/>
+                <w:sz w:val="22"/>
+                <w:szCs w:val="22"/>
+              </w:rPr>
+              <w:t>1989</w:t>
+            </w:r>
+          </w:p>
+        </w:tc>
+        <w:tc>
+          <w:tcPr>
+            <w:tcW w:w="4374" w:type="dxa"/>
+          </w:tcPr>
+          <w:p>
+            <w:pPr>
+              <w:pStyle w:val="Heading1"/>
+              <w:tabs>
+                <w:tab w:val="left" w:pos="745"/>
+              </w:tabs>
+              <w:ind w:left="0" w:firstLine="0"/>
+              <w:rPr>
+                <w:rFonts w:ascii="Times New Roman" w:hAnsi="Times New Roman" w:cs="Times New Roman"/>
+                <w:i w:val="0"/>
+                <w:iCs w:val="0"/>
+                <w:spacing w:val="-2"/>
+                <w:sz w:val="22"/>
+                <w:szCs w:val="22"/>
+              </w:rPr>
+            </w:pPr>
+            <w:r>
+              <w:rPr>
+                <w:rFonts w:ascii="Times New Roman" w:hAnsi="Times New Roman" w:cs="Times New Roman"/>
+                <w:i w:val="0"/>
+                <w:iCs w:val="0"/>
+                <w:spacing w:val="-2"/>
+                <w:sz w:val="22"/>
+                <w:szCs w:val="22"/>
+              </w:rPr>
+              <w:t>5,157,213</w:t>
+            </w:r>
+          </w:p>
+        </w:tc>
+      </w:tr>
+      <w:tr>
+        <w:tc>
+          <w:tcPr>
+            <w:tcW w:w="4371" w:type="dxa"/>
+          </w:tcPr>
+          <w:p>
+            <w:pPr>
+              <w:pStyle w:val="Heading1"/>
+              <w:tabs>
+                <w:tab w:val="left" w:pos="745"/>
+              </w:tabs>
+              <w:ind w:left="0" w:firstLine="0"/>
+              <w:rPr>
+                <w:rFonts w:ascii="Times New Roman" w:hAnsi="Times New Roman" w:cs="Times New Roman"/>
+                <w:i w:val="0"/>
+                <w:iCs w:val="0"/>
+                <w:spacing w:val="-2"/>
+                <w:sz w:val="22"/>
+                <w:szCs w:val="22"/>
+              </w:rPr>
+            </w:pPr>
+            <w:r>
+              <w:rPr>
+                <w:rFonts w:ascii="Times New Roman" w:hAnsi="Times New Roman" w:cs="Times New Roman"/>
+                <w:i w:val="0"/>
+                <w:iCs w:val="0"/>
+                <w:spacing w:val="-2"/>
+                <w:sz w:val="22"/>
+                <w:szCs w:val="22"/>
+              </w:rPr>
+              <w:t>1999</w:t>
+            </w:r>
+          </w:p>
+        </w:tc>
+        <w:tc>
+          <w:tcPr>
+            <w:tcW w:w="4374" w:type="dxa"/>
+          </w:tcPr>
+          <w:p>
+            <w:pPr>
+              <w:pStyle w:val="Heading1"/>
+              <w:tabs>
+                <w:tab w:val="left" w:pos="745"/>
+              </w:tabs>
+              <w:ind w:left="0" w:firstLine="0"/>
+              <w:rPr>
+                <w:rFonts w:ascii="Times New Roman" w:hAnsi="Times New Roman" w:cs="Times New Roman"/>
+                <w:i w:val="0"/>
+                <w:iCs w:val="0"/>
+                <w:spacing w:val="-2"/>
+                <w:sz w:val="22"/>
+                <w:szCs w:val="22"/>
+              </w:rPr>
+            </w:pPr>
+            <w:r>
+              <w:rPr>
+                <w:rFonts w:ascii="Times New Roman" w:hAnsi="Times New Roman" w:cs="Times New Roman"/>
+                <w:i w:val="0"/>
+                <w:iCs w:val="0"/>
+                <w:spacing w:val="-2"/>
+                <w:sz w:val="22"/>
+                <w:szCs w:val="22"/>
+              </w:rPr>
+              <w:t>5,039,569</w:t>
+            </w:r>
+          </w:p>
+        </w:tc>
+      </w:tr>
+      <w:tr>
+        <w:tc>
+          <w:tcPr>
+            <w:tcW w:w="4371" w:type="dxa"/>
+          </w:tcPr>
+          <w:p>
+            <w:pPr>
+              <w:pStyle w:val="Heading1"/>
+              <w:tabs>
+                <w:tab w:val="left" w:pos="745"/>
+              </w:tabs>
+              <w:ind w:left="0" w:firstLine="0"/>
+              <w:rPr>
+                <w:rFonts w:ascii="Times New Roman" w:hAnsi="Times New Roman" w:cs="Times New Roman"/>
+                <w:i w:val="0"/>
+                <w:iCs w:val="0"/>
+                <w:spacing w:val="-2"/>
+                <w:sz w:val="22"/>
+                <w:szCs w:val="22"/>
+              </w:rPr>
+            </w:pPr>
+            <w:r>
+              <w:rPr>
+                <w:rFonts w:ascii="Times New Roman" w:hAnsi="Times New Roman" w:cs="Times New Roman"/>
+                <w:i w:val="0"/>
+                <w:iCs w:val="0"/>
+                <w:spacing w:val="-2"/>
+                <w:sz w:val="22"/>
+                <w:szCs w:val="22"/>
+              </w:rPr>
+              <w:t>2009</w:t>
+            </w:r>
+          </w:p>
+        </w:tc>
+        <w:tc>
+          <w:tcPr>
+            <w:tcW w:w="4374" w:type="dxa"/>
+          </w:tcPr>
+          <w:p>
+            <w:pPr>
+              <w:pStyle w:val="Heading1"/>
+              <w:tabs>
+                <w:tab w:val="left" w:pos="745"/>
+              </w:tabs>
+              <w:ind w:left="0" w:firstLine="0"/>
+              <w:rPr>
+                <w:rFonts w:ascii="Times New Roman" w:hAnsi="Times New Roman" w:cs="Times New Roman"/>
+                <w:i w:val="0"/>
+                <w:iCs w:val="0"/>
+                <w:spacing w:val="-2"/>
+                <w:sz w:val="22"/>
+                <w:szCs w:val="22"/>
+              </w:rPr>
+            </w:pPr>
+            <w:r>
+              <w:rPr>
+                <w:rFonts w:ascii="Times New Roman" w:hAnsi="Times New Roman" w:cs="Times New Roman"/>
+                <w:i w:val="0"/>
+                <w:iCs w:val="0"/>
+                <w:spacing w:val="-2"/>
+                <w:sz w:val="22"/>
+                <w:szCs w:val="22"/>
+              </w:rPr>
+              <w:t>4,571,531</w:t>
+            </w:r>
+          </w:p>
+        </w:tc>
+      </w:tr>
+      <w:tr>
+        <w:tc>
+          <w:tcPr>
+            <w:tcW w:w="4371" w:type="dxa"/>
+          </w:tcPr>
+          <w:p>
+            <w:pPr>
+              <w:pStyle w:val="Heading1"/>
+              <w:tabs>
+                <w:tab w:val="left" w:pos="745"/>
+              </w:tabs>
+              <w:ind w:left="0" w:firstLine="0"/>
+              <w:rPr>
+                <w:rFonts w:ascii="Times New Roman" w:hAnsi="Times New Roman" w:cs="Times New Roman"/>
+                <w:i w:val="0"/>
+                <w:iCs w:val="0"/>
+                <w:spacing w:val="-2"/>
+                <w:sz w:val="22"/>
+                <w:szCs w:val="22"/>
+              </w:rPr>
+            </w:pPr>
+            <w:r>
+              <w:rPr>
+                <w:rFonts w:ascii="Times New Roman" w:hAnsi="Times New Roman" w:cs="Times New Roman"/>
+                <w:i w:val="0"/>
+                <w:iCs w:val="0"/>
+                <w:spacing w:val="-2"/>
+                <w:sz w:val="22"/>
+                <w:szCs w:val="22"/>
+              </w:rPr>
+              <w:t>2019</w:t>
+            </w:r>
+          </w:p>
+        </w:tc>
+        <w:tc>
+          <w:tcPr>
+            <w:tcW w:w="4374" w:type="dxa"/>
+          </w:tcPr>
+          <w:p>
+            <w:pPr>
+              <w:pStyle w:val="Heading1"/>
+              <w:tabs>
+                <w:tab w:val="left" w:pos="745"/>
+              </w:tabs>
+              <w:ind w:left="0" w:firstLine="0"/>
+              <w:rPr>
+                <w:rFonts w:ascii="Times New Roman" w:hAnsi="Times New Roman" w:cs="Times New Roman"/>
+                <w:i w:val="0"/>
+                <w:iCs w:val="0"/>
+                <w:spacing w:val="-2"/>
+                <w:sz w:val="22"/>
+                <w:szCs w:val="22"/>
+              </w:rPr>
+            </w:pPr>
+            <w:r>
+              <w:rPr>
+                <w:rFonts w:ascii="Times New Roman" w:hAnsi="Times New Roman" w:cs="Times New Roman"/>
+                <w:i w:val="0"/>
+                <w:iCs w:val="0"/>
+                <w:spacing w:val="-2"/>
+                <w:sz w:val="22"/>
+                <w:szCs w:val="22"/>
+              </w:rPr>
+              <w:t>4,987,658</w:t>
+            </w:r>
+          </w:p>
+        </w:tc>
+      </w:tr>
+    </w:tbl>
+    <w:p>
+      <w:pPr>
+        <w:pStyle w:val="Heading1"/>
+        <w:tabs>
+          <w:tab w:val="left" w:pos="745"/>
+        </w:tabs>
+        <w:ind w:left="37"/>
+        <w:rPr>
+          <w:rFonts w:ascii="Times New Roman" w:hAnsi="Times New Roman" w:cs="Times New Roman"/>
+          <w:spacing w:val="-2"/>
+          <w:sz w:val="16"/>
+          <w:szCs w:val="16"/>
+        </w:rPr>
+      </w:pPr>
+      <w:r>
+        <w:rPr>
+          <w:spacing w:val="-2"/>
+        </w:rPr>
+        <w:tab/>
+      </w:r>
+      <w:r>
+        <w:rPr>
+          <w:rFonts w:ascii="Times New Roman" w:hAnsi="Times New Roman" w:cs="Times New Roman"/>
+          <w:spacing w:val="-2"/>
+          <w:sz w:val="16"/>
+          <w:szCs w:val="16"/>
+        </w:rPr>
+        <w:t>Source: INE – Agricultural holdings area by geographic location (NUTS 2013). Values for "Continente" (code 1).</w:t>
+      </w:r>
+    </w:p>
+    <w:p>
+      <w:pPr>
+        <w:pStyle w:val="Heading1"/>
+        <w:tabs>
+          <w:tab w:val="left" w:pos="745"/>
+        </w:tabs>
+        <w:ind w:left="37" w:firstLine="0"/>
+        <w:rPr>
+          <w:rFonts w:ascii="Times New Roman" w:hAnsi="Times New Roman" w:cs="Times New Roman"/>
+          <w:i w:val="0"/>
+          <w:iCs w:val="0"/>
+          <w:spacing w:val="-2"/>
+          <w:sz w:val="22"/>
+          <w:szCs w:val="22"/>
+        </w:rPr>
+      </w:pPr>
+    </w:p>
+    <w:p>
+      <w:pPr>
+        <w:pStyle w:val="Heading1"/>
+        <w:tabs>
+          <w:tab w:val="left" w:pos="745"/>
+        </w:tabs>
+        <w:ind w:left="37"/>
+        <w:rPr>
+          <w:rFonts w:ascii="Times New Roman" w:hAnsi="Times New Roman" w:cs="Times New Roman"/>
+          <w:i w:val="0"/>
+          <w:iCs w:val="0"/>
+        </w:rPr>
+      </w:pPr>
+      <w:r>
+        <w:tab/>
+      </w:r>
+      <w:r>
+        <w:rPr>
+          <w:rFonts w:ascii="Times New Roman" w:hAnsi="Times New Roman" w:cs="Times New Roman"/>
+          <w:i w:val="0"/>
+          <w:iCs w:val="0"/>
+        </w:rPr>
+        <w:t>The total agricultural area decreased by only 3.3% between 1989 and 2019, from approximately 5.16 million hectares to 4.99 million hectares. This stands in stark contrast to the 59% reduction in agricultural labour over the same period, suggesting that land abandonment was not the primary driver of labour decline.</w:t>
+      </w:r>
+    </w:p>
+    <w:p>
+      <w:pPr>
+        <w:pStyle w:val="Heading1"/>
+        <w:tabs>
+          <w:tab w:val="left" w:pos="745"/>
+        </w:tabs>
+        <w:ind w:left="37" w:firstLine="0"/>
+        <w:rPr>
+          <w:rFonts w:ascii="Times New Roman" w:hAnsi="Times New Roman" w:cs="Times New Roman"/>
+          <w:i w:val="0"/>
+          <w:iCs w:val="0"/>
+          <w:sz w:val="22"/>
+          <w:szCs w:val="22"/>
+        </w:rPr>
+      </w:pPr>
+    </w:p>
+    <w:p>
+      <w:pPr>
+        <w:pStyle w:val="Heading1"/>
+        <w:tabs>
+          <w:tab w:val="left" w:pos="745"/>
+        </w:tabs>
+        <w:ind w:left="37"/>
+        <w:rPr>
+          <w:rFonts w:ascii="Times New Roman" w:hAnsi="Times New Roman" w:cs="Times New Roman"/>
+          <w:i w:val="0"/>
+          <w:iCs w:val="0"/>
+        </w:rPr>
+      </w:pPr>
+      <w:r>
+        <w:rPr>
+          <w:rFonts w:ascii="Times New Roman" w:hAnsi="Times New Roman" w:cs="Times New Roman"/>
+          <w:i w:val="0"/>
+          <w:iCs w:val="0"/>
+        </w:rPr>
+        <w:tab/>
+        <w:t>Figure 3.3 — Evolution of Total Agricultural Area (1989–2019</w:t>
+      </w:r>
+      <w:r>
+        <w:rPr>
+          <w:rFonts w:ascii="Times New Roman" w:hAnsi="Times New Roman" w:cs="Times New Roman"/>
+          <w:i w:val="0"/>
+          <w:iCs w:val="0"/>
+        </w:rPr>
+        <w:t>)</w:t>
+      </w:r>
+    </w:p>
+    <w:p>
+      <w:pPr>
+        <w:pStyle w:val="Heading1"/>
+        <w:tabs>
+          <w:tab w:val="left" w:pos="745"/>
+        </w:tabs>
+        <w:ind w:left="37" w:firstLine="0"/>
+        <w:rPr>
+          <w:rFonts w:ascii="Times New Roman" w:hAnsi="Times New Roman" w:cs="Times New Roman"/>
+          <w:i w:val="0"/>
+          <w:iCs w:val="0"/>
+          <w:sz w:val="22"/>
+          <w:szCs w:val="22"/>
+        </w:rPr>
+      </w:pPr>
+      <w:r>
+        <w:rPr>
+          <w:rFonts w:ascii="Times New Roman" w:hAnsi="Times New Roman" w:cs="Times New Roman"/>
+          <w:i w:val="0"/>
+          <w:iCs w:val="0"/>
+          <w:noProof/>
+          <w:sz w:val="22"/>
+          <w:szCs w:val="22"/>
+        </w:rPr>
+        <w:lastRenderedPageBreak/>
+        <w:drawing>
+          <wp:inline distT="0" distB="0" distL="0" distR="0" wp14:anchorId="0429D969" wp14:editId="54865687">
+            <wp:extent cx="4400550" cy="2559050"/>
+            <wp:effectExtent l="0" t="0" r="0" b="12700"/>
+            <wp:docPr id="1455216147" name="Chart 1"/>
+            <wp:cNvGraphicFramePr/>
+            <a:graphic xmlns:a="http://schemas.openxmlformats.org/drawingml/2006/main">
+              <a:graphicData uri="http://schemas.openxmlformats.org/drawingml/2006/chart">
+                <c:chart xmlns:c="http://schemas.openxmlformats.org/drawingml/2006/chart" xmlns:r="http://schemas.openxmlformats.org/officeDocument/2006/relationships" r:id="rId10"/>
+              </a:graphicData>
+            </a:graphic>
+          </wp:inline>
+        </w:drawing>
+      </w:r>
+    </w:p>
+    <w:p>
+      <w:pPr>
+        <w:pStyle w:val="Heading1"/>
+        <w:tabs>
+          <w:tab w:val="left" w:pos="745"/>
+        </w:tabs>
+        <w:ind w:left="37" w:firstLine="0"/>
+        <w:rPr>
+          <w:rFonts w:ascii="Times New Roman" w:hAnsi="Times New Roman" w:cs="Times New Roman"/>
+          <w:i w:val="0"/>
+          <w:iCs w:val="0"/>
+          <w:sz w:val="22"/>
+          <w:szCs w:val="22"/>
+        </w:rPr>
+      </w:pPr>
+    </w:p>
+    <w:p>
+      <w:pPr>
+        <w:pStyle w:val="Heading1"/>
+        <w:tabs>
+          <w:tab w:val="left" w:pos="745"/>
+        </w:tabs>
+        <w:ind w:left="37"/>
+        <w:rPr>
+          <w:rFonts w:ascii="Times New Roman" w:hAnsi="Times New Roman" w:cs="Times New Roman"/>
+          <w:i w:val="0"/>
+          <w:iCs w:val="0"/>
+          <w:sz w:val="22"/>
+          <w:szCs w:val="22"/>
+        </w:rPr>
+      </w:pPr>
+      <w:r>
+        <w:rPr>
+          <w:rFonts w:ascii="Times New Roman" w:hAnsi="Times New Roman" w:cs="Times New Roman"/>
+          <w:i w:val="0"/>
+          <w:iCs w:val="0"/>
+          <w:sz w:val="22"/>
+          <w:szCs w:val="22"/>
+        </w:rPr>
+        <w:tab/>
+      </w:r>
+      <w:r>
+        <w:rPr>
+          <w:rFonts w:ascii="Times New Roman" w:hAnsi="Times New Roman" w:cs="Times New Roman"/>
+          <w:i w:val="0"/>
+          <w:iCs w:val="0"/>
+          <w:sz w:val="22"/>
+          <w:szCs w:val="22"/>
+        </w:rPr>
+        <w:t>Three key observations emerge from this analysis:</w:t>
+      </w:r>
+    </w:p>
+    <w:p>
+      <w:pPr>
+        <w:pStyle w:val="Heading1"/>
+        <w:tabs>
+          <w:tab w:val="left" w:pos="745"/>
+        </w:tabs>
+        <w:ind w:left="37"/>
+        <w:rPr>
+          <w:rFonts w:ascii="Times New Roman" w:hAnsi="Times New Roman" w:cs="Times New Roman"/>
+          <w:i w:val="0"/>
+          <w:iCs w:val="0"/>
+          <w:sz w:val="22"/>
+          <w:szCs w:val="22"/>
+        </w:rPr>
+      </w:pPr>
+    </w:p>
+    <w:p>
+      <w:pPr>
+        <w:pStyle w:val="Heading1"/>
+        <w:tabs>
+          <w:tab w:val="left" w:pos="745"/>
+        </w:tabs>
+        <w:ind w:left="37"/>
+        <w:rPr>
+          <w:rFonts w:ascii="Times New Roman" w:hAnsi="Times New Roman" w:cs="Times New Roman"/>
+          <w:i w:val="0"/>
+          <w:iCs w:val="0"/>
+          <w:sz w:val="22"/>
+          <w:szCs w:val="22"/>
+        </w:rPr>
+      </w:pPr>
+      <w:r>
+        <w:rPr>
+          <w:rFonts w:ascii="Times New Roman" w:hAnsi="Times New Roman" w:cs="Times New Roman"/>
+          <w:i w:val="0"/>
+          <w:iCs w:val="0"/>
+          <w:sz w:val="22"/>
+          <w:szCs w:val="22"/>
+        </w:rPr>
+        <w:tab/>
+      </w:r>
+      <w:r>
+        <w:rPr>
+          <w:rFonts w:ascii="Times New Roman" w:hAnsi="Times New Roman" w:cs="Times New Roman"/>
+          <w:i w:val="0"/>
+          <w:iCs w:val="0"/>
+          <w:sz w:val="22"/>
+          <w:szCs w:val="22"/>
+        </w:rPr>
+        <w:t>1. Relative stability (1989–1999): The agricultural area remained nearly constant between 1989 and 1999, decreasing by only 117,644 ha (2.3%). This suggests that during the first decade of analysis, labour decline was driven primarily by mechanization and efficiency gains rather than land abandonment.</w:t>
+      </w:r>
+    </w:p>
+    <w:p>
+      <w:pPr>
+        <w:pStyle w:val="Heading1"/>
+        <w:tabs>
+          <w:tab w:val="left" w:pos="745"/>
+        </w:tabs>
+        <w:ind w:left="37"/>
+        <w:rPr>
+          <w:rFonts w:ascii="Times New Roman" w:hAnsi="Times New Roman" w:cs="Times New Roman"/>
+          <w:i w:val="0"/>
+          <w:iCs w:val="0"/>
+          <w:sz w:val="22"/>
+          <w:szCs w:val="22"/>
+        </w:rPr>
+      </w:pPr>
+    </w:p>
+    <w:p>
+      <w:pPr>
+        <w:pStyle w:val="Heading1"/>
+        <w:tabs>
+          <w:tab w:val="left" w:pos="745"/>
+        </w:tabs>
+        <w:ind w:left="37"/>
+        <w:rPr>
+          <w:rFonts w:ascii="Times New Roman" w:hAnsi="Times New Roman" w:cs="Times New Roman"/>
+          <w:i w:val="0"/>
+          <w:iCs w:val="0"/>
+          <w:sz w:val="22"/>
+          <w:szCs w:val="22"/>
+        </w:rPr>
+      </w:pPr>
+      <w:r>
+        <w:rPr>
+          <w:rFonts w:ascii="Times New Roman" w:hAnsi="Times New Roman" w:cs="Times New Roman"/>
+          <w:i w:val="0"/>
+          <w:iCs w:val="0"/>
+          <w:sz w:val="22"/>
+          <w:szCs w:val="22"/>
+        </w:rPr>
+        <w:tab/>
+      </w:r>
+      <w:r>
+        <w:rPr>
+          <w:rFonts w:ascii="Times New Roman" w:hAnsi="Times New Roman" w:cs="Times New Roman"/>
+          <w:i w:val="0"/>
+          <w:iCs w:val="0"/>
+          <w:sz w:val="22"/>
+          <w:szCs w:val="22"/>
+        </w:rPr>
+        <w:t>2. Notable decline (1999–2009</w:t>
+      </w:r>
+      <w:r>
+        <w:rPr>
+          <w:rFonts w:ascii="Times New Roman" w:hAnsi="Times New Roman" w:cs="Times New Roman"/>
+          <w:i w:val="0"/>
+          <w:iCs w:val="0"/>
+          <w:sz w:val="22"/>
+          <w:szCs w:val="22"/>
+        </w:rPr>
+        <w:t>): The</w:t>
+      </w:r>
+      <w:r>
+        <w:rPr>
+          <w:rFonts w:ascii="Times New Roman" w:hAnsi="Times New Roman" w:cs="Times New Roman"/>
+          <w:i w:val="0"/>
+          <w:iCs w:val="0"/>
+          <w:sz w:val="22"/>
+          <w:szCs w:val="22"/>
+        </w:rPr>
+        <w:t xml:space="preserve"> period between 1999 and 2009 saw the largest reduction in agricultural area, with a loss of 468,038 ha (9.3%). This coincides with the continued adjustment to CAP reforms and may reflect the abandonment of marginal agricultural land, particularly in less productive regions.</w:t>
+      </w:r>
+    </w:p>
+    <w:p>
+      <w:pPr>
+        <w:pStyle w:val="Heading1"/>
+        <w:tabs>
+          <w:tab w:val="left" w:pos="745"/>
+        </w:tabs>
+        <w:ind w:left="37"/>
+        <w:rPr>
+          <w:rFonts w:ascii="Times New Roman" w:hAnsi="Times New Roman" w:cs="Times New Roman"/>
+          <w:i w:val="0"/>
+          <w:iCs w:val="0"/>
+          <w:sz w:val="22"/>
+          <w:szCs w:val="22"/>
+        </w:rPr>
+      </w:pPr>
+    </w:p>
+    <w:p>
+      <w:pPr>
+        <w:pStyle w:val="Heading1"/>
+        <w:tabs>
+          <w:tab w:val="left" w:pos="745"/>
+        </w:tabs>
+        <w:ind w:left="37" w:firstLine="0"/>
+        <w:rPr>
+          <w:rFonts w:ascii="Times New Roman" w:hAnsi="Times New Roman" w:cs="Times New Roman"/>
+          <w:i w:val="0"/>
+          <w:iCs w:val="0"/>
+          <w:sz w:val="22"/>
+          <w:szCs w:val="22"/>
+        </w:rPr>
+      </w:pPr>
+      <w:r>
+        <w:rPr>
+          <w:rFonts w:ascii="Times New Roman" w:hAnsi="Times New Roman" w:cs="Times New Roman"/>
+          <w:i w:val="0"/>
+          <w:iCs w:val="0"/>
+          <w:sz w:val="22"/>
+          <w:szCs w:val="22"/>
+        </w:rPr>
+        <w:t>3. Recovery and stabilization (2009–2019): Between 2009 and 2019, agricultural area increased by 416,127 ha (9.1%), nearly recovering to 1999 levels. This recovery may be associated with the expansion of permanent crops, particularly olive groves and vineyards, which have been supported by EU investment programs (INE, 2020).</w:t>
+      </w:r>
+    </w:p>
+    <w:p>
+      <w:pPr>
+        <w:pStyle w:val="Heading1"/>
+        <w:tabs>
+          <w:tab w:val="left" w:pos="745"/>
+        </w:tabs>
+      </w:pPr>
     </w:p>
     <w:p>
       <w:pPr>
@@ -4384,11 +5925,6 @@
     </w:p>
     <w:p>
       <w:pPr>
-        <w:pStyle w:val="ListParagraph"/>
-      </w:pPr>
-    </w:p>
-    <w:p>
-      <w:pPr>
         <w:pStyle w:val="Heading1"/>
         <w:tabs>
           <w:tab w:val="left" w:pos="745"/>
@@ -4419,7 +5955,7 @@
         <w:spacing w:line="249" w:lineRule="auto"/>
         <w:jc w:val="both"/>
         <w:sectPr>
-          <w:headerReference w:type="default" r:id="rId9"/>
+          <w:headerReference w:type="default" r:id="rId11"/>
           <w:pgSz w:w="11910" w:h="16840"/>
           <w:pgMar w:top="1020" w:right="1559" w:bottom="280" w:left="1559" w:header="615" w:footer="0" w:gutter="0"/>
           <w:cols w:space="720"/>
@@ -4572,15 +6108,7 @@
         </w:tabs>
       </w:pPr>
       <w:r>
-        <w:t xml:space="preserve">Statistical test </w:t>
-      </w:r>
-      <w:proofErr w:type="gramStart"/>
-      <w:r>
-        <w:t>of</w:t>
-      </w:r>
-      <w:proofErr w:type="gramEnd"/>
-      <w:r>
-        <w:t xml:space="preserve"> agricultural labour</w:t>
+        <w:t>Statistical test of agricultural labour</w:t>
       </w:r>
     </w:p>
     <w:p>
@@ -4634,15 +6162,7 @@
         <w:spacing w:line="249" w:lineRule="auto"/>
       </w:pPr>
       <w:r>
-        <w:t xml:space="preserve">Statistical test </w:t>
-      </w:r>
-      <w:proofErr w:type="gramStart"/>
-      <w:r>
-        <w:t>of</w:t>
-      </w:r>
-      <w:proofErr w:type="gramEnd"/>
-      <w:r>
-        <w:t xml:space="preserve"> crop systems</w:t>
+        <w:t>Statistical test of crop systems</w:t>
       </w:r>
     </w:p>
     <w:p>
@@ -5644,6 +7164,119 @@
     </w:lvl>
   </w:abstractNum>
   <w:abstractNum w:abstractNumId="6" w15:restartNumberingAfterBreak="0">
+    <w:nsid w:val="61901F43"/>
+    <w:multiLevelType w:val="multilevel"/>
+    <w:tmpl w:val="EEA4B09C"/>
+    <w:lvl w:ilvl="0">
+      <w:start w:val="1"/>
+      <w:numFmt w:val="decimal"/>
+      <w:lvlText w:val="%1."/>
+      <w:lvlJc w:val="left"/>
+      <w:pPr>
+        <w:tabs>
+          <w:tab w:val="num" w:pos="720"/>
+        </w:tabs>
+        <w:ind w:left="720" w:hanging="360"/>
+      </w:pPr>
+    </w:lvl>
+    <w:lvl w:ilvl="1" w:tentative="1">
+      <w:start w:val="1"/>
+      <w:numFmt w:val="decimal"/>
+      <w:lvlText w:val="%2."/>
+      <w:lvlJc w:val="left"/>
+      <w:pPr>
+        <w:tabs>
+          <w:tab w:val="num" w:pos="1440"/>
+        </w:tabs>
+        <w:ind w:left="1440" w:hanging="360"/>
+      </w:pPr>
+    </w:lvl>
+    <w:lvl w:ilvl="2" w:tentative="1">
+      <w:start w:val="1"/>
+      <w:numFmt w:val="decimal"/>
+      <w:lvlText w:val="%3."/>
+      <w:lvlJc w:val="left"/>
+      <w:pPr>
+        <w:tabs>
+          <w:tab w:val="num" w:pos="2160"/>
+        </w:tabs>
+        <w:ind w:left="2160" w:hanging="360"/>
+      </w:pPr>
+    </w:lvl>
+    <w:lvl w:ilvl="3" w:tentative="1">
+      <w:start w:val="1"/>
+      <w:numFmt w:val="decimal"/>
+      <w:lvlText w:val="%4."/>
+      <w:lvlJc w:val="left"/>
+      <w:pPr>
+        <w:tabs>
+          <w:tab w:val="num" w:pos="2880"/>
+        </w:tabs>
+        <w:ind w:left="2880" w:hanging="360"/>
+      </w:pPr>
+    </w:lvl>
+    <w:lvl w:ilvl="4" w:tentative="1">
+      <w:start w:val="1"/>
+      <w:numFmt w:val="decimal"/>
+      <w:lvlText w:val="%5."/>
+      <w:lvlJc w:val="left"/>
+      <w:pPr>
+        <w:tabs>
+          <w:tab w:val="num" w:pos="3600"/>
+        </w:tabs>
+        <w:ind w:left="3600" w:hanging="360"/>
+      </w:pPr>
+    </w:lvl>
+    <w:lvl w:ilvl="5" w:tentative="1">
+      <w:start w:val="1"/>
+      <w:numFmt w:val="decimal"/>
+      <w:lvlText w:val="%6."/>
+      <w:lvlJc w:val="left"/>
+      <w:pPr>
+        <w:tabs>
+          <w:tab w:val="num" w:pos="4320"/>
+        </w:tabs>
+        <w:ind w:left="4320" w:hanging="360"/>
+      </w:pPr>
+    </w:lvl>
+    <w:lvl w:ilvl="6" w:tentative="1">
+      <w:start w:val="1"/>
+      <w:numFmt w:val="decimal"/>
+      <w:lvlText w:val="%7."/>
+      <w:lvlJc w:val="left"/>
+      <w:pPr>
+        <w:tabs>
+          <w:tab w:val="num" w:pos="5040"/>
+        </w:tabs>
+        <w:ind w:left="5040" w:hanging="360"/>
+      </w:pPr>
+    </w:lvl>
+    <w:lvl w:ilvl="7" w:tentative="1">
+      <w:start w:val="1"/>
+      <w:numFmt w:val="decimal"/>
+      <w:lvlText w:val="%8."/>
+      <w:lvlJc w:val="left"/>
+      <w:pPr>
+        <w:tabs>
+          <w:tab w:val="num" w:pos="5760"/>
+        </w:tabs>
+        <w:ind w:left="5760" w:hanging="360"/>
+      </w:pPr>
+    </w:lvl>
+    <w:lvl w:ilvl="8" w:tentative="1">
+      <w:start w:val="1"/>
+      <w:numFmt w:val="decimal"/>
+      <w:lvlText w:val="%9."/>
+      <w:lvlJc w:val="left"/>
+      <w:pPr>
+        <w:tabs>
+          <w:tab w:val="num" w:pos="6480"/>
+        </w:tabs>
+        <w:ind w:left="6480" w:hanging="360"/>
+      </w:pPr>
+    </w:lvl>
+  </w:abstractNum>
+  <w:abstractNum w:abstractNumId="7" w15:restartNumberingAfterBreak="0">
     <w:nsid w:val="6DD378FB"/>
     <w:multiLevelType w:val="hybridMultilevel"/>
     <w:tmpl w:val="F87E864C"/>
@@ -5732,7 +7365,7 @@
       </w:pPr>
     </w:lvl>
   </w:abstractNum>
-  <w:abstractNum w:abstractNumId="7" w15:restartNumberingAfterBreak="0">
+  <w:abstractNum w:abstractNumId="8" w15:restartNumberingAfterBreak="0">
     <w:nsid w:val="73374D86"/>
     <w:multiLevelType w:val="multilevel"/>
     <w:tmpl w:val="30A0E4A6"/>
@@ -5856,7 +7489,7 @@
     </w:lvl>
   </w:abstractNum>
   <w:num w:numId="1" w16cid:durableId="1139882341">
-    <w:abstractNumId w:val="7"/>
+    <w:abstractNumId w:val="8"/>
   </w:num>
   <w:num w:numId="2" w16cid:durableId="1671984375">
     <w:abstractNumId w:val="2"/>
@@ -5877,6 +7510,9 @@
     <w:abstractNumId w:val="3"/>
   </w:num>
   <w:num w:numId="8" w16cid:durableId="524638695">
+    <w:abstractNumId w:val="7"/>
+  </w:num>
+  <w:num w:numId="9" w16cid:durableId="1898469407">
     <w:abstractNumId w:val="6"/>
   </w:num>
 </w:numbering>
@@ -6532,7 +8168,1797 @@
       <w:szCs w:val="24"/>
     </w:rPr>
   </w:style>
+  <w:style w:type="table" w:styleId="TableGrid">
+    <w:name w:val="Table Grid"/>
+    <w:basedOn w:val="TableNormal"/>
+    <w:uiPriority w:val="39"/>
+    <w:rsid w:val="006320D4"/>
+    <w:tblPr>
+      <w:tblBorders>
+        <w:top w:val="single" w:sz="4" w:space="0" w:color="auto"/>
+        <w:left w:val="single" w:sz="4" w:space="0" w:color="auto"/>
+        <w:bottom w:val="single" w:sz="4" w:space="0" w:color="auto"/>
+        <w:right w:val="single" w:sz="4" w:space="0" w:color="auto"/>
+        <w:insideH w:val="single" w:sz="4" w:space="0" w:color="auto"/>
+        <w:insideV w:val="single" w:sz="4" w:space="0" w:color="auto"/>
+      </w:tblBorders>
+    </w:tblPr>
+  </w:style>
+  <w:style w:type="paragraph" w:customStyle="1" w:styleId="ds-markdown-paragraph">
+    <w:name w:val="ds-markdown-paragraph"/>
+    <w:basedOn w:val="Normal"/>
+    <w:rsid w:val="006320D4"/>
+    <w:pPr>
+      <w:widowControl/>
+      <w:autoSpaceDE/>
+      <w:autoSpaceDN/>
+      <w:spacing w:before="100" w:beforeAutospacing="1" w:after="100" w:afterAutospacing="1"/>
+    </w:pPr>
+    <w:rPr>
+      <w:sz w:val="24"/>
+      <w:szCs w:val="24"/>
+    </w:rPr>
+  </w:style>
 </w:styles>
+</file>
+
+<file path=word/charts/chart1.xml><?xml version="1.0" encoding="utf-8"?>
+<c:chartSpace xmlns:c="http://schemas.openxmlformats.org/drawingml/2006/chart" xmlns:a="http://schemas.openxmlformats.org/drawingml/2006/main" xmlns:r="http://schemas.openxmlformats.org/officeDocument/2006/relationships" xmlns:c16r2="http://schemas.microsoft.com/office/drawing/2015/06/chart">
+  <c:date1904 val="0"/>
+  <c:lang val="en-US"/>
+  <c:roundedCorners val="0"/>
+  <mc:AlternateContent xmlns:mc="http://schemas.openxmlformats.org/markup-compatibility/2006">
+    <mc:Choice xmlns:c14="http://schemas.microsoft.com/office/drawing/2007/8/2/chart" Requires="c14">
+      <c14:style val="105"/>
+    </mc:Choice>
+    <mc:Fallback>
+      <c:style val="5"/>
+    </mc:Fallback>
+  </mc:AlternateContent>
+  <c:chart>
+    <c:title>
+      <c:tx>
+        <c:rich>
+          <a:bodyPr rot="0" spcFirstLastPara="1" vertOverflow="ellipsis" vert="horz" wrap="square" anchor="ctr" anchorCtr="1"/>
+          <a:lstStyle/>
+          <a:p>
+            <a:pPr>
+              <a:defRPr sz="1400" b="0" i="0" u="none" strike="noStrike" kern="1200" spc="0" baseline="0">
+                <a:solidFill>
+                  <a:schemeClr val="tx1">
+                    <a:lumMod val="65000"/>
+                    <a:lumOff val="35000"/>
+                  </a:schemeClr>
+                </a:solidFill>
+                <a:latin typeface="+mn-lt"/>
+                <a:ea typeface="+mn-ea"/>
+                <a:cs typeface="+mn-cs"/>
+              </a:defRPr>
+            </a:pPr>
+            <a:r>
+              <a:rPr lang="en-US"/>
+              <a:t>Total Agricultural Labour (N.º) – all regimes
+</a:t>
+            </a:r>
+          </a:p>
+        </c:rich>
+      </c:tx>
+      <c:overlay val="0"/>
+      <c:spPr>
+        <a:noFill/>
+        <a:ln>
+          <a:noFill/>
+        </a:ln>
+        <a:effectLst/>
+      </c:spPr>
+      <c:txPr>
+        <a:bodyPr rot="0" spcFirstLastPara="1" vertOverflow="ellipsis" vert="horz" wrap="square" anchor="ctr" anchorCtr="1"/>
+        <a:lstStyle/>
+        <a:p>
+          <a:pPr>
+            <a:defRPr sz="1400" b="0" i="0" u="none" strike="noStrike" kern="1200" spc="0" baseline="0">
+              <a:solidFill>
+                <a:schemeClr val="tx1">
+                  <a:lumMod val="65000"/>
+                  <a:lumOff val="35000"/>
+                </a:schemeClr>
+              </a:solidFill>
+              <a:latin typeface="+mn-lt"/>
+              <a:ea typeface="+mn-ea"/>
+              <a:cs typeface="+mn-cs"/>
+            </a:defRPr>
+          </a:pPr>
+          <a:endParaRPr lang="en-US"/>
+        </a:p>
+      </c:txPr>
+    </c:title>
+    <c:autoTitleDeleted val="0"/>
+    <c:plotArea>
+      <c:layout/>
+      <c:lineChart>
+        <c:grouping val="standard"/>
+        <c:varyColors val="0"/>
+        <c:ser>
+          <c:idx val="0"/>
+          <c:order val="0"/>
+          <c:tx>
+            <c:strRef>
+              <c:f>Sheet1!$B$1</c:f>
+              <c:strCache>
+                <c:ptCount val="1"/>
+                <c:pt idx="0">
+                  <c:v>Total agricultural labour (N.º) – all regimes
+</c:v>
+                </c:pt>
+              </c:strCache>
+            </c:strRef>
+          </c:tx>
+          <c:spPr>
+            <a:ln w="28575" cap="rnd">
+              <a:solidFill>
+                <a:schemeClr val="accent3"/>
+              </a:solidFill>
+              <a:round/>
+            </a:ln>
+            <a:effectLst/>
+          </c:spPr>
+          <c:marker>
+            <c:symbol val="circle"/>
+            <c:size val="5"/>
+            <c:spPr>
+              <a:solidFill>
+                <a:schemeClr val="accent3"/>
+              </a:solidFill>
+              <a:ln w="9525">
+                <a:solidFill>
+                  <a:schemeClr val="accent3"/>
+                </a:solidFill>
+              </a:ln>
+              <a:effectLst/>
+            </c:spPr>
+          </c:marker>
+          <c:cat>
+            <c:strRef>
+              <c:f>Sheet1!$A$2:$A$6</c:f>
+              <c:strCache>
+                <c:ptCount val="5"/>
+                <c:pt idx="0">
+                  <c:v>Years</c:v>
+                </c:pt>
+                <c:pt idx="1">
+                  <c:v>1989</c:v>
+                </c:pt>
+                <c:pt idx="2">
+                  <c:v>1999</c:v>
+                </c:pt>
+                <c:pt idx="3">
+                  <c:v>2009</c:v>
+                </c:pt>
+                <c:pt idx="4">
+                  <c:v>2019</c:v>
+                </c:pt>
+              </c:strCache>
+            </c:strRef>
+          </c:cat>
+          <c:val>
+            <c:numRef>
+              <c:f>Sheet1!$B$2:$B$6</c:f>
+              <c:numCache>
+                <c:formatCode>#,##0</c:formatCode>
+                <c:ptCount val="5"/>
+                <c:pt idx="1">
+                  <c:v>1449906</c:v>
+                </c:pt>
+                <c:pt idx="2">
+                  <c:v>1002480</c:v>
+                </c:pt>
+                <c:pt idx="3">
+                  <c:v>649607</c:v>
+                </c:pt>
+                <c:pt idx="4">
+                  <c:v>596938</c:v>
+                </c:pt>
+              </c:numCache>
+            </c:numRef>
+          </c:val>
+          <c:smooth val="0"/>
+          <c:extLst>
+            <c:ext xmlns:c16="http://schemas.microsoft.com/office/drawing/2014/chart" uri="{C3380CC4-5D6E-409C-BE32-E72D297353CC}">
+              <c16:uniqueId val="{00000000-5582-4D27-AA26-B94D06433950}"/>
+            </c:ext>
+          </c:extLst>
+        </c:ser>
+        <c:dLbls>
+          <c:showLegendKey val="0"/>
+          <c:showVal val="0"/>
+          <c:showCatName val="0"/>
+          <c:showSerName val="0"/>
+          <c:showPercent val="0"/>
+          <c:showBubbleSize val="0"/>
+        </c:dLbls>
+        <c:marker val="1"/>
+        <c:smooth val="0"/>
+        <c:axId val="872830528"/>
+        <c:axId val="872840608"/>
+      </c:lineChart>
+      <c:catAx>
+        <c:axId val="872830528"/>
+        <c:scaling>
+          <c:orientation val="minMax"/>
+        </c:scaling>
+        <c:delete val="0"/>
+        <c:axPos val="b"/>
+        <c:numFmt formatCode="General" sourceLinked="1"/>
+        <c:majorTickMark val="none"/>
+        <c:minorTickMark val="none"/>
+        <c:tickLblPos val="nextTo"/>
+        <c:spPr>
+          <a:noFill/>
+          <a:ln w="9525" cap="flat" cmpd="sng" algn="ctr">
+            <a:solidFill>
+              <a:schemeClr val="tx1">
+                <a:lumMod val="15000"/>
+                <a:lumOff val="85000"/>
+              </a:schemeClr>
+            </a:solidFill>
+            <a:round/>
+          </a:ln>
+          <a:effectLst/>
+        </c:spPr>
+        <c:txPr>
+          <a:bodyPr rot="-60000000" spcFirstLastPara="1" vertOverflow="ellipsis" vert="horz" wrap="square" anchor="ctr" anchorCtr="1"/>
+          <a:lstStyle/>
+          <a:p>
+            <a:pPr>
+              <a:defRPr sz="900" b="0" i="0" u="none" strike="noStrike" kern="1200" baseline="0">
+                <a:solidFill>
+                  <a:schemeClr val="tx1">
+                    <a:lumMod val="65000"/>
+                    <a:lumOff val="35000"/>
+                  </a:schemeClr>
+                </a:solidFill>
+                <a:latin typeface="+mn-lt"/>
+                <a:ea typeface="+mn-ea"/>
+                <a:cs typeface="+mn-cs"/>
+              </a:defRPr>
+            </a:pPr>
+            <a:endParaRPr lang="en-US"/>
+          </a:p>
+        </c:txPr>
+        <c:crossAx val="872840608"/>
+        <c:crosses val="autoZero"/>
+        <c:auto val="1"/>
+        <c:lblAlgn val="ctr"/>
+        <c:lblOffset val="100"/>
+        <c:noMultiLvlLbl val="0"/>
+      </c:catAx>
+      <c:valAx>
+        <c:axId val="872840608"/>
+        <c:scaling>
+          <c:orientation val="minMax"/>
+        </c:scaling>
+        <c:delete val="0"/>
+        <c:axPos val="l"/>
+        <c:majorGridlines>
+          <c:spPr>
+            <a:ln w="9525" cap="flat" cmpd="sng" algn="ctr">
+              <a:solidFill>
+                <a:schemeClr val="tx1">
+                  <a:lumMod val="15000"/>
+                  <a:lumOff val="85000"/>
+                </a:schemeClr>
+              </a:solidFill>
+              <a:round/>
+            </a:ln>
+            <a:effectLst/>
+          </c:spPr>
+        </c:majorGridlines>
+        <c:numFmt formatCode="#,##0" sourceLinked="1"/>
+        <c:majorTickMark val="none"/>
+        <c:minorTickMark val="none"/>
+        <c:tickLblPos val="nextTo"/>
+        <c:spPr>
+          <a:noFill/>
+          <a:ln>
+            <a:noFill/>
+          </a:ln>
+          <a:effectLst/>
+        </c:spPr>
+        <c:txPr>
+          <a:bodyPr rot="-60000000" spcFirstLastPara="1" vertOverflow="ellipsis" vert="horz" wrap="square" anchor="ctr" anchorCtr="1"/>
+          <a:lstStyle/>
+          <a:p>
+            <a:pPr>
+              <a:defRPr sz="900" b="0" i="0" u="none" strike="noStrike" kern="1200" baseline="0">
+                <a:solidFill>
+                  <a:schemeClr val="tx1">
+                    <a:lumMod val="65000"/>
+                    <a:lumOff val="35000"/>
+                  </a:schemeClr>
+                </a:solidFill>
+                <a:latin typeface="+mn-lt"/>
+                <a:ea typeface="+mn-ea"/>
+                <a:cs typeface="+mn-cs"/>
+              </a:defRPr>
+            </a:pPr>
+            <a:endParaRPr lang="en-US"/>
+          </a:p>
+        </c:txPr>
+        <c:crossAx val="872830528"/>
+        <c:crosses val="autoZero"/>
+        <c:crossBetween val="between"/>
+      </c:valAx>
+      <c:spPr>
+        <a:noFill/>
+        <a:ln>
+          <a:noFill/>
+        </a:ln>
+        <a:effectLst/>
+      </c:spPr>
+    </c:plotArea>
+    <c:legend>
+      <c:legendPos val="b"/>
+      <c:overlay val="0"/>
+      <c:spPr>
+        <a:noFill/>
+        <a:ln>
+          <a:noFill/>
+        </a:ln>
+        <a:effectLst/>
+      </c:spPr>
+      <c:txPr>
+        <a:bodyPr rot="0" spcFirstLastPara="1" vertOverflow="ellipsis" vert="horz" wrap="square" anchor="ctr" anchorCtr="1"/>
+        <a:lstStyle/>
+        <a:p>
+          <a:pPr>
+            <a:defRPr sz="900" b="0" i="0" u="none" strike="noStrike" kern="1200" baseline="0">
+              <a:solidFill>
+                <a:schemeClr val="tx1">
+                  <a:lumMod val="65000"/>
+                  <a:lumOff val="35000"/>
+                </a:schemeClr>
+              </a:solidFill>
+              <a:latin typeface="+mn-lt"/>
+              <a:ea typeface="+mn-ea"/>
+              <a:cs typeface="+mn-cs"/>
+            </a:defRPr>
+          </a:pPr>
+          <a:endParaRPr lang="en-US"/>
+        </a:p>
+      </c:txPr>
+    </c:legend>
+    <c:plotVisOnly val="1"/>
+    <c:dispBlanksAs val="gap"/>
+    <c:showDLblsOverMax val="0"/>
+    <c:extLst>
+      <c:ext xmlns:c16r3="http://schemas.microsoft.com/office/drawing/2017/03/chart" uri="{56B9EC1D-385E-4148-901F-78D8002777C0}">
+        <c16r3:dataDisplayOptions16>
+          <c16r3:dispNaAsBlank val="1"/>
+        </c16r3:dataDisplayOptions16>
+      </c:ext>
+    </c:extLst>
+  </c:chart>
+  <c:spPr>
+    <a:solidFill>
+      <a:schemeClr val="bg1"/>
+    </a:solidFill>
+    <a:ln w="9525" cap="flat" cmpd="sng" algn="ctr">
+      <a:solidFill>
+        <a:schemeClr val="tx1">
+          <a:lumMod val="15000"/>
+          <a:lumOff val="85000"/>
+        </a:schemeClr>
+      </a:solidFill>
+      <a:round/>
+    </a:ln>
+    <a:effectLst/>
+  </c:spPr>
+  <c:txPr>
+    <a:bodyPr/>
+    <a:lstStyle/>
+    <a:p>
+      <a:pPr>
+        <a:defRPr/>
+      </a:pPr>
+      <a:endParaRPr lang="en-US"/>
+    </a:p>
+  </c:txPr>
+  <c:externalData r:id="rId3">
+    <c:autoUpdate val="0"/>
+  </c:externalData>
+</c:chartSpace>
+</file>
+
+<file path=word/charts/chart2.xml><?xml version="1.0" encoding="utf-8"?>
+<c:chartSpace xmlns:c="http://schemas.openxmlformats.org/drawingml/2006/chart" xmlns:a="http://schemas.openxmlformats.org/drawingml/2006/main" xmlns:r="http://schemas.openxmlformats.org/officeDocument/2006/relationships" xmlns:c16r2="http://schemas.microsoft.com/office/drawing/2015/06/chart">
+  <c:date1904 val="0"/>
+  <c:lang val="en-US"/>
+  <c:roundedCorners val="0"/>
+  <mc:AlternateContent xmlns:mc="http://schemas.openxmlformats.org/markup-compatibility/2006">
+    <mc:Choice xmlns:c14="http://schemas.microsoft.com/office/drawing/2007/8/2/chart" Requires="c14">
+      <c14:style val="102"/>
+    </mc:Choice>
+    <mc:Fallback>
+      <c:style val="2"/>
+    </mc:Fallback>
+  </mc:AlternateContent>
+  <c:chart>
+    <c:title>
+      <c:overlay val="0"/>
+      <c:spPr>
+        <a:noFill/>
+        <a:ln>
+          <a:noFill/>
+        </a:ln>
+        <a:effectLst/>
+      </c:spPr>
+      <c:txPr>
+        <a:bodyPr rot="0" spcFirstLastPara="1" vertOverflow="ellipsis" vert="horz" wrap="square" anchor="ctr" anchorCtr="1"/>
+        <a:lstStyle/>
+        <a:p>
+          <a:pPr>
+            <a:defRPr sz="1400" b="0" i="0" u="none" strike="noStrike" kern="1200" spc="0" baseline="0">
+              <a:solidFill>
+                <a:schemeClr val="tx1">
+                  <a:lumMod val="65000"/>
+                  <a:lumOff val="35000"/>
+                </a:schemeClr>
+              </a:solidFill>
+              <a:latin typeface="+mn-lt"/>
+              <a:ea typeface="+mn-ea"/>
+              <a:cs typeface="+mn-cs"/>
+            </a:defRPr>
+          </a:pPr>
+          <a:endParaRPr lang="en-US"/>
+        </a:p>
+      </c:txPr>
+    </c:title>
+    <c:autoTitleDeleted val="0"/>
+    <c:plotArea>
+      <c:layout/>
+      <c:lineChart>
+        <c:grouping val="standard"/>
+        <c:varyColors val="0"/>
+        <c:ser>
+          <c:idx val="0"/>
+          <c:order val="0"/>
+          <c:tx>
+            <c:strRef>
+              <c:f>Sheet1!$B$1</c:f>
+              <c:strCache>
+                <c:ptCount val="1"/>
+                <c:pt idx="0">
+                  <c:v>Agricultural Holdings Area (ha)</c:v>
+                </c:pt>
+              </c:strCache>
+            </c:strRef>
+          </c:tx>
+          <c:spPr>
+            <a:ln w="28575" cap="rnd">
+              <a:solidFill>
+                <a:schemeClr val="accent1"/>
+              </a:solidFill>
+              <a:round/>
+            </a:ln>
+            <a:effectLst/>
+          </c:spPr>
+          <c:marker>
+            <c:symbol val="none"/>
+          </c:marker>
+          <c:cat>
+            <c:strRef>
+              <c:f>Sheet1!$A$2:$A$6</c:f>
+              <c:strCache>
+                <c:ptCount val="5"/>
+                <c:pt idx="0">
+                  <c:v>Year</c:v>
+                </c:pt>
+                <c:pt idx="1">
+                  <c:v>1989</c:v>
+                </c:pt>
+                <c:pt idx="2">
+                  <c:v>1999</c:v>
+                </c:pt>
+                <c:pt idx="3">
+                  <c:v>2009</c:v>
+                </c:pt>
+                <c:pt idx="4">
+                  <c:v>2019</c:v>
+                </c:pt>
+              </c:strCache>
+            </c:strRef>
+          </c:cat>
+          <c:val>
+            <c:numRef>
+              <c:f>Sheet1!$B$2:$B$6</c:f>
+              <c:numCache>
+                <c:formatCode>#,##0</c:formatCode>
+                <c:ptCount val="5"/>
+                <c:pt idx="1">
+                  <c:v>5157213</c:v>
+                </c:pt>
+                <c:pt idx="2" formatCode="General">
+                  <c:v>5039569</c:v>
+                </c:pt>
+                <c:pt idx="3" formatCode="General">
+                  <c:v>4571531</c:v>
+                </c:pt>
+                <c:pt idx="4" formatCode="General">
+                  <c:v>4987658</c:v>
+                </c:pt>
+              </c:numCache>
+            </c:numRef>
+          </c:val>
+          <c:smooth val="0"/>
+          <c:extLst>
+            <c:ext xmlns:c16="http://schemas.microsoft.com/office/drawing/2014/chart" uri="{C3380CC4-5D6E-409C-BE32-E72D297353CC}">
+              <c16:uniqueId val="{00000000-6D59-43C7-91B3-8F4F0ECF03A3}"/>
+            </c:ext>
+          </c:extLst>
+        </c:ser>
+        <c:dLbls>
+          <c:showLegendKey val="0"/>
+          <c:showVal val="0"/>
+          <c:showCatName val="0"/>
+          <c:showSerName val="0"/>
+          <c:showPercent val="0"/>
+          <c:showBubbleSize val="0"/>
+        </c:dLbls>
+        <c:smooth val="0"/>
+        <c:axId val="598683391"/>
+        <c:axId val="598683871"/>
+      </c:lineChart>
+      <c:catAx>
+        <c:axId val="598683391"/>
+        <c:scaling>
+          <c:orientation val="minMax"/>
+        </c:scaling>
+        <c:delete val="0"/>
+        <c:axPos val="b"/>
+        <c:numFmt formatCode="General" sourceLinked="1"/>
+        <c:majorTickMark val="none"/>
+        <c:minorTickMark val="none"/>
+        <c:tickLblPos val="nextTo"/>
+        <c:spPr>
+          <a:noFill/>
+          <a:ln w="9525" cap="flat" cmpd="sng" algn="ctr">
+            <a:solidFill>
+              <a:schemeClr val="tx1">
+                <a:lumMod val="15000"/>
+                <a:lumOff val="85000"/>
+              </a:schemeClr>
+            </a:solidFill>
+            <a:round/>
+          </a:ln>
+          <a:effectLst/>
+        </c:spPr>
+        <c:txPr>
+          <a:bodyPr rot="-60000000" spcFirstLastPara="1" vertOverflow="ellipsis" vert="horz" wrap="square" anchor="ctr" anchorCtr="1"/>
+          <a:lstStyle/>
+          <a:p>
+            <a:pPr>
+              <a:defRPr sz="900" b="0" i="0" u="none" strike="noStrike" kern="1200" baseline="0">
+                <a:solidFill>
+                  <a:schemeClr val="tx1">
+                    <a:lumMod val="65000"/>
+                    <a:lumOff val="35000"/>
+                  </a:schemeClr>
+                </a:solidFill>
+                <a:latin typeface="+mn-lt"/>
+                <a:ea typeface="+mn-ea"/>
+                <a:cs typeface="+mn-cs"/>
+              </a:defRPr>
+            </a:pPr>
+            <a:endParaRPr lang="en-US"/>
+          </a:p>
+        </c:txPr>
+        <c:crossAx val="598683871"/>
+        <c:crosses val="autoZero"/>
+        <c:auto val="1"/>
+        <c:lblAlgn val="ctr"/>
+        <c:lblOffset val="100"/>
+        <c:noMultiLvlLbl val="0"/>
+      </c:catAx>
+      <c:valAx>
+        <c:axId val="598683871"/>
+        <c:scaling>
+          <c:orientation val="minMax"/>
+        </c:scaling>
+        <c:delete val="0"/>
+        <c:axPos val="l"/>
+        <c:majorGridlines>
+          <c:spPr>
+            <a:ln w="9525" cap="flat" cmpd="sng" algn="ctr">
+              <a:solidFill>
+                <a:schemeClr val="tx1">
+                  <a:lumMod val="15000"/>
+                  <a:lumOff val="85000"/>
+                </a:schemeClr>
+              </a:solidFill>
+              <a:round/>
+            </a:ln>
+            <a:effectLst/>
+          </c:spPr>
+        </c:majorGridlines>
+        <c:numFmt formatCode="#,##0" sourceLinked="1"/>
+        <c:majorTickMark val="none"/>
+        <c:minorTickMark val="none"/>
+        <c:tickLblPos val="nextTo"/>
+        <c:spPr>
+          <a:noFill/>
+          <a:ln>
+            <a:noFill/>
+          </a:ln>
+          <a:effectLst/>
+        </c:spPr>
+        <c:txPr>
+          <a:bodyPr rot="-60000000" spcFirstLastPara="1" vertOverflow="ellipsis" vert="horz" wrap="square" anchor="ctr" anchorCtr="1"/>
+          <a:lstStyle/>
+          <a:p>
+            <a:pPr>
+              <a:defRPr sz="900" b="0" i="0" u="none" strike="noStrike" kern="1200" baseline="0">
+                <a:solidFill>
+                  <a:schemeClr val="tx1">
+                    <a:lumMod val="65000"/>
+                    <a:lumOff val="35000"/>
+                  </a:schemeClr>
+                </a:solidFill>
+                <a:latin typeface="+mn-lt"/>
+                <a:ea typeface="+mn-ea"/>
+                <a:cs typeface="+mn-cs"/>
+              </a:defRPr>
+            </a:pPr>
+            <a:endParaRPr lang="en-US"/>
+          </a:p>
+        </c:txPr>
+        <c:crossAx val="598683391"/>
+        <c:crosses val="autoZero"/>
+        <c:crossBetween val="between"/>
+      </c:valAx>
+      <c:spPr>
+        <a:noFill/>
+        <a:ln>
+          <a:noFill/>
+        </a:ln>
+        <a:effectLst/>
+      </c:spPr>
+    </c:plotArea>
+    <c:legend>
+      <c:legendPos val="b"/>
+      <c:overlay val="0"/>
+      <c:spPr>
+        <a:noFill/>
+        <a:ln>
+          <a:noFill/>
+        </a:ln>
+        <a:effectLst/>
+      </c:spPr>
+      <c:txPr>
+        <a:bodyPr rot="0" spcFirstLastPara="1" vertOverflow="ellipsis" vert="horz" wrap="square" anchor="ctr" anchorCtr="1"/>
+        <a:lstStyle/>
+        <a:p>
+          <a:pPr>
+            <a:defRPr sz="900" b="0" i="0" u="none" strike="noStrike" kern="1200" baseline="0">
+              <a:solidFill>
+                <a:schemeClr val="tx1">
+                  <a:lumMod val="65000"/>
+                  <a:lumOff val="35000"/>
+                </a:schemeClr>
+              </a:solidFill>
+              <a:latin typeface="+mn-lt"/>
+              <a:ea typeface="+mn-ea"/>
+              <a:cs typeface="+mn-cs"/>
+            </a:defRPr>
+          </a:pPr>
+          <a:endParaRPr lang="en-US"/>
+        </a:p>
+      </c:txPr>
+    </c:legend>
+    <c:plotVisOnly val="1"/>
+    <c:dispBlanksAs val="gap"/>
+    <c:showDLblsOverMax val="0"/>
+    <c:extLst>
+      <c:ext xmlns:c16r3="http://schemas.microsoft.com/office/drawing/2017/03/chart" uri="{56B9EC1D-385E-4148-901F-78D8002777C0}">
+        <c16r3:dataDisplayOptions16>
+          <c16r3:dispNaAsBlank val="1"/>
+        </c16r3:dataDisplayOptions16>
+      </c:ext>
+    </c:extLst>
+  </c:chart>
+  <c:spPr>
+    <a:solidFill>
+      <a:schemeClr val="bg1"/>
+    </a:solidFill>
+    <a:ln w="9525" cap="flat" cmpd="sng" algn="ctr">
+      <a:solidFill>
+        <a:schemeClr val="tx1">
+          <a:lumMod val="15000"/>
+          <a:lumOff val="85000"/>
+        </a:schemeClr>
+      </a:solidFill>
+      <a:round/>
+    </a:ln>
+    <a:effectLst/>
+  </c:spPr>
+  <c:txPr>
+    <a:bodyPr/>
+    <a:lstStyle/>
+    <a:p>
+      <a:pPr>
+        <a:defRPr/>
+      </a:pPr>
+      <a:endParaRPr lang="en-US"/>
+    </a:p>
+  </c:txPr>
+  <c:externalData r:id="rId3">
+    <c:autoUpdate val="0"/>
+  </c:externalData>
+</c:chartSpace>
+</file>
+
+<file path=word/charts/colors1.xml><?xml version="1.0" encoding="utf-8"?>
+<cs:colorStyle xmlns:cs="http://schemas.microsoft.com/office/drawing/2012/chartStyle" xmlns:a="http://schemas.openxmlformats.org/drawingml/2006/main" meth="withinLinear" id="16">
+  <a:schemeClr val="accent3"/>
+</cs:colorStyle>
+</file>
+
+<file path=word/charts/colors2.xml><?xml version="1.0" encoding="utf-8"?>
+<cs:colorStyle xmlns:cs="http://schemas.microsoft.com/office/drawing/2012/chartStyle" xmlns:a="http://schemas.openxmlformats.org/drawingml/2006/main" meth="cycle" id="10">
+  <a:schemeClr val="accent1"/>
+  <a:schemeClr val="accent2"/>
+  <a:schemeClr val="accent3"/>
+  <a:schemeClr val="accent4"/>
+  <a:schemeClr val="accent5"/>
+  <a:schemeClr val="accent6"/>
+  <cs:variation/>
+  <cs:variation>
+    <a:lumMod val="60000"/>
+  </cs:variation>
+  <cs:variation>
+    <a:lumMod val="80000"/>
+    <a:lumOff val="20000"/>
+  </cs:variation>
+  <cs:variation>
+    <a:lumMod val="80000"/>
+  </cs:variation>
+  <cs:variation>
+    <a:lumMod val="60000"/>
+    <a:lumOff val="40000"/>
+  </cs:variation>
+  <cs:variation>
+    <a:lumMod val="50000"/>
+  </cs:variation>
+  <cs:variation>
+    <a:lumMod val="70000"/>
+    <a:lumOff val="30000"/>
+  </cs:variation>
+  <cs:variation>
+    <a:lumMod val="70000"/>
+  </cs:variation>
+  <cs:variation>
+    <a:lumMod val="50000"/>
+    <a:lumOff val="50000"/>
+  </cs:variation>
+</cs:colorStyle>
+</file>
+
+<file path=word/charts/style1.xml><?xml version="1.0" encoding="utf-8"?>
+<cs:chartStyle xmlns:cs="http://schemas.microsoft.com/office/drawing/2012/chartStyle" xmlns:a="http://schemas.openxmlformats.org/drawingml/2006/main" id="332">
+  <cs:axisTitle>
+    <cs:lnRef idx="0"/>
+    <cs:fillRef idx="0"/>
+    <cs:effectRef idx="0"/>
+    <cs:fontRef idx="minor">
+      <a:schemeClr val="tx1">
+        <a:lumMod val="65000"/>
+        <a:lumOff val="35000"/>
+      </a:schemeClr>
+    </cs:fontRef>
+    <cs:defRPr sz="1000" kern="1200"/>
+  </cs:axisTitle>
+  <cs:categoryAxis>
+    <cs:lnRef idx="0"/>
+    <cs:fillRef idx="0"/>
+    <cs:effectRef idx="0"/>
+    <cs:fontRef idx="minor">
+      <a:schemeClr val="tx1">
+        <a:lumMod val="65000"/>
+        <a:lumOff val="35000"/>
+      </a:schemeClr>
+    </cs:fontRef>
+    <cs:spPr>
+      <a:ln w="9525" cap="flat" cmpd="sng" algn="ctr">
+        <a:solidFill>
+          <a:schemeClr val="tx1">
+            <a:lumMod val="15000"/>
+            <a:lumOff val="85000"/>
+          </a:schemeClr>
+        </a:solidFill>
+        <a:round/>
+      </a:ln>
+    </cs:spPr>
+    <cs:defRPr sz="900" kern="1200"/>
+  </cs:categoryAxis>
+  <cs:chartArea mods="allowNoFillOverride allowNoLineOverride">
+    <cs:lnRef idx="0"/>
+    <cs:fillRef idx="0"/>
+    <cs:effectRef idx="0"/>
+    <cs:fontRef idx="minor">
+      <a:schemeClr val="tx1"/>
+    </cs:fontRef>
+    <cs:spPr>
+      <a:solidFill>
+        <a:schemeClr val="bg1"/>
+      </a:solidFill>
+      <a:ln w="9525" cap="flat" cmpd="sng" algn="ctr">
+        <a:solidFill>
+          <a:schemeClr val="tx1">
+            <a:lumMod val="15000"/>
+            <a:lumOff val="85000"/>
+          </a:schemeClr>
+        </a:solidFill>
+        <a:round/>
+      </a:ln>
+    </cs:spPr>
+    <cs:defRPr sz="1000" kern="1200"/>
+  </cs:chartArea>
+  <cs:dataLabel>
+    <cs:lnRef idx="0"/>
+    <cs:fillRef idx="0"/>
+    <cs:effectRef idx="0"/>
+    <cs:fontRef idx="minor">
+      <a:schemeClr val="tx1">
+        <a:lumMod val="75000"/>
+        <a:lumOff val="25000"/>
+      </a:schemeClr>
+    </cs:fontRef>
+    <cs:defRPr sz="900" kern="1200"/>
+  </cs:dataLabel>
+  <cs:dataLabelCallout>
+    <cs:lnRef idx="0"/>
+    <cs:fillRef idx="0"/>
+    <cs:effectRef idx="0"/>
+    <cs:fontRef idx="minor">
+      <a:schemeClr val="dk1">
+        <a:lumMod val="65000"/>
+        <a:lumOff val="35000"/>
+      </a:schemeClr>
+    </cs:fontRef>
+    <cs:spPr>
+      <a:solidFill>
+        <a:schemeClr val="lt1"/>
+      </a:solidFill>
+      <a:ln>
+        <a:solidFill>
+          <a:schemeClr val="dk1">
+            <a:lumMod val="25000"/>
+            <a:lumOff val="75000"/>
+          </a:schemeClr>
+        </a:solidFill>
+      </a:ln>
+    </cs:spPr>
+    <cs:defRPr sz="900" kern="1200"/>
+    <cs:bodyPr rot="0" spcFirstLastPara="1" vertOverflow="clip" horzOverflow="clip" vert="horz" wrap="square" lIns="36576" tIns="18288" rIns="36576" bIns="18288" anchor="ctr" anchorCtr="1">
+      <a:spAutoFit/>
+    </cs:bodyPr>
+  </cs:dataLabelCallout>
+  <cs:dataPoint>
+    <cs:lnRef idx="0"/>
+    <cs:fillRef idx="1">
+      <cs:styleClr val="auto"/>
+    </cs:fillRef>
+    <cs:effectRef idx="0"/>
+    <cs:fontRef idx="minor">
+      <a:schemeClr val="tx1"/>
+    </cs:fontRef>
+  </cs:dataPoint>
+  <cs:dataPoint3D>
+    <cs:lnRef idx="0"/>
+    <cs:fillRef idx="1">
+      <cs:styleClr val="auto"/>
+    </cs:fillRef>
+    <cs:effectRef idx="0"/>
+    <cs:fontRef idx="minor">
+      <a:schemeClr val="tx1"/>
+    </cs:fontRef>
+  </cs:dataPoint3D>
+  <cs:dataPointLine>
+    <cs:lnRef idx="0">
+      <cs:styleClr val="auto"/>
+    </cs:lnRef>
+    <cs:fillRef idx="1"/>
+    <cs:effectRef idx="0"/>
+    <cs:fontRef idx="minor">
+      <a:schemeClr val="tx1"/>
+    </cs:fontRef>
+    <cs:spPr>
+      <a:ln w="28575" cap="rnd">
+        <a:solidFill>
+          <a:schemeClr val="phClr"/>
+        </a:solidFill>
+        <a:round/>
+      </a:ln>
+    </cs:spPr>
+  </cs:dataPointLine>
+  <cs:dataPointMarker>
+    <cs:lnRef idx="0">
+      <cs:styleClr val="auto"/>
+    </cs:lnRef>
+    <cs:fillRef idx="1">
+      <cs:styleClr val="auto"/>
+    </cs:fillRef>
+    <cs:effectRef idx="0"/>
+    <cs:fontRef idx="minor">
+      <a:schemeClr val="tx1"/>
+    </cs:fontRef>
+    <cs:spPr>
+      <a:ln w="9525">
+        <a:solidFill>
+          <a:schemeClr val="phClr"/>
+        </a:solidFill>
+      </a:ln>
+    </cs:spPr>
+  </cs:dataPointMarker>
+  <cs:dataPointMarkerLayout symbol="circle" size="5"/>
+  <cs:dataPointWireframe>
+    <cs:lnRef idx="0">
+      <cs:styleClr val="auto"/>
+    </cs:lnRef>
+    <cs:fillRef idx="1"/>
+    <cs:effectRef idx="0"/>
+    <cs:fontRef idx="minor">
+      <a:schemeClr val="tx1"/>
+    </cs:fontRef>
+    <cs:spPr>
+      <a:ln w="9525" cap="rnd">
+        <a:solidFill>
+          <a:schemeClr val="phClr"/>
+        </a:solidFill>
+        <a:round/>
+      </a:ln>
+    </cs:spPr>
+  </cs:dataPointWireframe>
+  <cs:dataTable>
+    <cs:lnRef idx="0"/>
+    <cs:fillRef idx="0"/>
+    <cs:effectRef idx="0"/>
+    <cs:fontRef idx="minor">
+      <a:schemeClr val="tx1">
+        <a:lumMod val="65000"/>
+        <a:lumOff val="35000"/>
+      </a:schemeClr>
+    </cs:fontRef>
+    <cs:spPr>
+      <a:noFill/>
+      <a:ln w="9525" cap="flat" cmpd="sng" algn="ctr">
+        <a:solidFill>
+          <a:schemeClr val="tx1">
+            <a:lumMod val="15000"/>
+            <a:lumOff val="85000"/>
+          </a:schemeClr>
+        </a:solidFill>
+        <a:round/>
+      </a:ln>
+    </cs:spPr>
+    <cs:defRPr sz="900" kern="1200"/>
+  </cs:dataTable>
+  <cs:downBar>
+    <cs:lnRef idx="0"/>
+    <cs:fillRef idx="0"/>
+    <cs:effectRef idx="0"/>
+    <cs:fontRef idx="minor">
+      <a:schemeClr val="dk1"/>
+    </cs:fontRef>
+    <cs:spPr>
+      <a:solidFill>
+        <a:schemeClr val="dk1">
+          <a:lumMod val="65000"/>
+          <a:lumOff val="35000"/>
+        </a:schemeClr>
+      </a:solidFill>
+      <a:ln w="9525">
+        <a:solidFill>
+          <a:schemeClr val="tx1">
+            <a:lumMod val="65000"/>
+            <a:lumOff val="35000"/>
+          </a:schemeClr>
+        </a:solidFill>
+      </a:ln>
+    </cs:spPr>
+  </cs:downBar>
+  <cs:dropLine>
+    <cs:lnRef idx="0"/>
+    <cs:fillRef idx="0"/>
+    <cs:effectRef idx="0"/>
+    <cs:fontRef idx="minor">
+      <a:schemeClr val="tx1"/>
+    </cs:fontRef>
+    <cs:spPr>
+      <a:ln w="9525" cap="flat" cmpd="sng" algn="ctr">
+        <a:solidFill>
+          <a:schemeClr val="tx1">
+            <a:lumMod val="35000"/>
+            <a:lumOff val="65000"/>
+          </a:schemeClr>
+        </a:solidFill>
+        <a:round/>
+      </a:ln>
+    </cs:spPr>
+  </cs:dropLine>
+  <cs:errorBar>
+    <cs:lnRef idx="0"/>
+    <cs:fillRef idx="0"/>
+    <cs:effectRef idx="0"/>
+    <cs:fontRef idx="minor">
+      <a:schemeClr val="tx1"/>
+    </cs:fontRef>
+    <cs:spPr>
+      <a:ln w="9525" cap="flat" cmpd="sng" algn="ctr">
+        <a:solidFill>
+          <a:schemeClr val="tx1">
+            <a:lumMod val="65000"/>
+            <a:lumOff val="35000"/>
+          </a:schemeClr>
+        </a:solidFill>
+        <a:round/>
+      </a:ln>
+    </cs:spPr>
+  </cs:errorBar>
+  <cs:floor>
+    <cs:lnRef idx="0"/>
+    <cs:fillRef idx="0"/>
+    <cs:effectRef idx="0"/>
+    <cs:fontRef idx="minor">
+      <a:schemeClr val="tx1"/>
+    </cs:fontRef>
+    <cs:spPr>
+      <a:noFill/>
+      <a:ln>
+        <a:noFill/>
+      </a:ln>
+    </cs:spPr>
+  </cs:floor>
+  <cs:gridlineMajor>
+    <cs:lnRef idx="0"/>
+    <cs:fillRef idx="0"/>
+    <cs:effectRef idx="0"/>
+    <cs:fontRef idx="minor">
+      <a:schemeClr val="tx1"/>
+    </cs:fontRef>
+    <cs:spPr>
+      <a:ln w="9525" cap="flat" cmpd="sng" algn="ctr">
+        <a:solidFill>
+          <a:schemeClr val="tx1">
+            <a:lumMod val="15000"/>
+            <a:lumOff val="85000"/>
+          </a:schemeClr>
+        </a:solidFill>
+        <a:round/>
+      </a:ln>
+    </cs:spPr>
+  </cs:gridlineMajor>
+  <cs:gridlineMinor>
+    <cs:lnRef idx="0"/>
+    <cs:fillRef idx="0"/>
+    <cs:effectRef idx="0"/>
+    <cs:fontRef idx="minor">
+      <a:schemeClr val="tx1"/>
+    </cs:fontRef>
+    <cs:spPr>
+      <a:ln w="9525" cap="flat" cmpd="sng" algn="ctr">
+        <a:solidFill>
+          <a:schemeClr val="tx1">
+            <a:lumMod val="5000"/>
+            <a:lumOff val="95000"/>
+          </a:schemeClr>
+        </a:solidFill>
+        <a:round/>
+      </a:ln>
+    </cs:spPr>
+  </cs:gridlineMinor>
+  <cs:hiLoLine>
+    <cs:lnRef idx="0"/>
+    <cs:fillRef idx="0"/>
+    <cs:effectRef idx="0"/>
+    <cs:fontRef idx="minor">
+      <a:schemeClr val="tx1"/>
+    </cs:fontRef>
+    <cs:spPr>
+      <a:ln w="9525" cap="flat" cmpd="sng" algn="ctr">
+        <a:solidFill>
+          <a:schemeClr val="tx1">
+            <a:lumMod val="75000"/>
+            <a:lumOff val="25000"/>
+          </a:schemeClr>
+        </a:solidFill>
+        <a:round/>
+      </a:ln>
+    </cs:spPr>
+  </cs:hiLoLine>
+  <cs:leaderLine>
+    <cs:lnRef idx="0"/>
+    <cs:fillRef idx="0"/>
+    <cs:effectRef idx="0"/>
+    <cs:fontRef idx="minor">
+      <a:schemeClr val="tx1"/>
+    </cs:fontRef>
+    <cs:spPr>
+      <a:ln w="9525" cap="flat" cmpd="sng" algn="ctr">
+        <a:solidFill>
+          <a:schemeClr val="tx1">
+            <a:lumMod val="35000"/>
+            <a:lumOff val="65000"/>
+          </a:schemeClr>
+        </a:solidFill>
+        <a:round/>
+      </a:ln>
+    </cs:spPr>
+  </cs:leaderLine>
+  <cs:legend>
+    <cs:lnRef idx="0"/>
+    <cs:fillRef idx="0"/>
+    <cs:effectRef idx="0"/>
+    <cs:fontRef idx="minor">
+      <a:schemeClr val="tx1">
+        <a:lumMod val="65000"/>
+        <a:lumOff val="35000"/>
+      </a:schemeClr>
+    </cs:fontRef>
+    <cs:defRPr sz="900" kern="1200"/>
+  </cs:legend>
+  <cs:plotArea mods="allowNoFillOverride allowNoLineOverride">
+    <cs:lnRef idx="0"/>
+    <cs:fillRef idx="0"/>
+    <cs:effectRef idx="0"/>
+    <cs:fontRef idx="minor">
+      <a:schemeClr val="tx1"/>
+    </cs:fontRef>
+  </cs:plotArea>
+  <cs:plotArea3D mods="allowNoFillOverride allowNoLineOverride">
+    <cs:lnRef idx="0"/>
+    <cs:fillRef idx="0"/>
+    <cs:effectRef idx="0"/>
+    <cs:fontRef idx="minor">
+      <a:schemeClr val="tx1"/>
+    </cs:fontRef>
+  </cs:plotArea3D>
+  <cs:seriesAxis>
+    <cs:lnRef idx="0"/>
+    <cs:fillRef idx="0"/>
+    <cs:effectRef idx="0"/>
+    <cs:fontRef idx="minor">
+      <a:schemeClr val="tx1">
+        <a:lumMod val="65000"/>
+        <a:lumOff val="35000"/>
+      </a:schemeClr>
+    </cs:fontRef>
+    <cs:defRPr sz="900" kern="1200"/>
+  </cs:seriesAxis>
+  <cs:seriesLine>
+    <cs:lnRef idx="0"/>
+    <cs:fillRef idx="0"/>
+    <cs:effectRef idx="0"/>
+    <cs:fontRef idx="minor">
+      <a:schemeClr val="tx1"/>
+    </cs:fontRef>
+    <cs:spPr>
+      <a:ln w="9525" cap="flat" cmpd="sng" algn="ctr">
+        <a:solidFill>
+          <a:schemeClr val="tx1">
+            <a:lumMod val="35000"/>
+            <a:lumOff val="65000"/>
+          </a:schemeClr>
+        </a:solidFill>
+        <a:round/>
+      </a:ln>
+    </cs:spPr>
+  </cs:seriesLine>
+  <cs:title>
+    <cs:lnRef idx="0"/>
+    <cs:fillRef idx="0"/>
+    <cs:effectRef idx="0"/>
+    <cs:fontRef idx="minor">
+      <a:schemeClr val="tx1">
+        <a:lumMod val="65000"/>
+        <a:lumOff val="35000"/>
+      </a:schemeClr>
+    </cs:fontRef>
+    <cs:defRPr sz="1400" b="0" kern="1200" spc="0" baseline="0"/>
+  </cs:title>
+  <cs:trendline>
+    <cs:lnRef idx="0">
+      <cs:styleClr val="auto"/>
+    </cs:lnRef>
+    <cs:fillRef idx="0"/>
+    <cs:effectRef idx="0"/>
+    <cs:fontRef idx="minor">
+      <a:schemeClr val="tx1"/>
+    </cs:fontRef>
+    <cs:spPr>
+      <a:ln w="19050" cap="rnd">
+        <a:solidFill>
+          <a:schemeClr val="phClr"/>
+        </a:solidFill>
+        <a:prstDash val="sysDot"/>
+      </a:ln>
+    </cs:spPr>
+  </cs:trendline>
+  <cs:trendlineLabel>
+    <cs:lnRef idx="0"/>
+    <cs:fillRef idx="0"/>
+    <cs:effectRef idx="0"/>
+    <cs:fontRef idx="minor">
+      <a:schemeClr val="tx1">
+        <a:lumMod val="65000"/>
+        <a:lumOff val="35000"/>
+      </a:schemeClr>
+    </cs:fontRef>
+    <cs:defRPr sz="900" kern="1200"/>
+  </cs:trendlineLabel>
+  <cs:upBar>
+    <cs:lnRef idx="0"/>
+    <cs:fillRef idx="0"/>
+    <cs:effectRef idx="0"/>
+    <cs:fontRef idx="minor">
+      <a:schemeClr val="dk1"/>
+    </cs:fontRef>
+    <cs:spPr>
+      <a:solidFill>
+        <a:schemeClr val="lt1"/>
+      </a:solidFill>
+      <a:ln w="9525">
+        <a:solidFill>
+          <a:schemeClr val="tx1">
+            <a:lumMod val="15000"/>
+            <a:lumOff val="85000"/>
+          </a:schemeClr>
+        </a:solidFill>
+      </a:ln>
+    </cs:spPr>
+  </cs:upBar>
+  <cs:valueAxis>
+    <cs:lnRef idx="0"/>
+    <cs:fillRef idx="0"/>
+    <cs:effectRef idx="0"/>
+    <cs:fontRef idx="minor">
+      <a:schemeClr val="tx1">
+        <a:lumMod val="65000"/>
+        <a:lumOff val="35000"/>
+      </a:schemeClr>
+    </cs:fontRef>
+    <cs:defRPr sz="900" kern="1200"/>
+  </cs:valueAxis>
+  <cs:wall>
+    <cs:lnRef idx="0"/>
+    <cs:fillRef idx="0"/>
+    <cs:effectRef idx="0"/>
+    <cs:fontRef idx="minor">
+      <a:schemeClr val="tx1"/>
+    </cs:fontRef>
+    <cs:spPr>
+      <a:noFill/>
+      <a:ln>
+        <a:noFill/>
+      </a:ln>
+    </cs:spPr>
+  </cs:wall>
+</cs:chartStyle>
+</file>
+
+<file path=word/charts/style2.xml><?xml version="1.0" encoding="utf-8"?>
+<cs:chartStyle xmlns:cs="http://schemas.microsoft.com/office/drawing/2012/chartStyle" xmlns:a="http://schemas.openxmlformats.org/drawingml/2006/main" id="227">
+  <cs:axisTitle>
+    <cs:lnRef idx="0"/>
+    <cs:fillRef idx="0"/>
+    <cs:effectRef idx="0"/>
+    <cs:fontRef idx="minor">
+      <a:schemeClr val="tx1">
+        <a:lumMod val="65000"/>
+        <a:lumOff val="35000"/>
+      </a:schemeClr>
+    </cs:fontRef>
+    <cs:defRPr sz="1000" kern="1200"/>
+  </cs:axisTitle>
+  <cs:categoryAxis>
+    <cs:lnRef idx="0"/>
+    <cs:fillRef idx="0"/>
+    <cs:effectRef idx="0"/>
+    <cs:fontRef idx="minor">
+      <a:schemeClr val="tx1">
+        <a:lumMod val="65000"/>
+        <a:lumOff val="35000"/>
+      </a:schemeClr>
+    </cs:fontRef>
+    <cs:spPr>
+      <a:ln w="9525" cap="flat" cmpd="sng" algn="ctr">
+        <a:solidFill>
+          <a:schemeClr val="tx1">
+            <a:lumMod val="15000"/>
+            <a:lumOff val="85000"/>
+          </a:schemeClr>
+        </a:solidFill>
+        <a:round/>
+      </a:ln>
+    </cs:spPr>
+    <cs:defRPr sz="900" kern="1200"/>
+  </cs:categoryAxis>
+  <cs:chartArea mods="allowNoFillOverride allowNoLineOverride">
+    <cs:lnRef idx="0"/>
+    <cs:fillRef idx="0"/>
+    <cs:effectRef idx="0"/>
+    <cs:fontRef idx="minor">
+      <a:schemeClr val="tx1"/>
+    </cs:fontRef>
+    <cs:spPr>
+      <a:solidFill>
+        <a:schemeClr val="bg1"/>
+      </a:solidFill>
+      <a:ln w="9525" cap="flat" cmpd="sng" algn="ctr">
+        <a:solidFill>
+          <a:schemeClr val="tx1">
+            <a:lumMod val="15000"/>
+            <a:lumOff val="85000"/>
+          </a:schemeClr>
+        </a:solidFill>
+        <a:round/>
+      </a:ln>
+    </cs:spPr>
+    <cs:defRPr sz="1000" kern="1200"/>
+  </cs:chartArea>
+  <cs:dataLabel>
+    <cs:lnRef idx="0"/>
+    <cs:fillRef idx="0"/>
+    <cs:effectRef idx="0"/>
+    <cs:fontRef idx="minor">
+      <a:schemeClr val="tx1">
+        <a:lumMod val="75000"/>
+        <a:lumOff val="25000"/>
+      </a:schemeClr>
+    </cs:fontRef>
+    <cs:defRPr sz="900" kern="1200"/>
+  </cs:dataLabel>
+  <cs:dataLabelCallout>
+    <cs:lnRef idx="0"/>
+    <cs:fillRef idx="0"/>
+    <cs:effectRef idx="0"/>
+    <cs:fontRef idx="minor">
+      <a:schemeClr val="dk1">
+        <a:lumMod val="65000"/>
+        <a:lumOff val="35000"/>
+      </a:schemeClr>
+    </cs:fontRef>
+    <cs:spPr>
+      <a:solidFill>
+        <a:schemeClr val="lt1"/>
+      </a:solidFill>
+      <a:ln>
+        <a:solidFill>
+          <a:schemeClr val="dk1">
+            <a:lumMod val="25000"/>
+            <a:lumOff val="75000"/>
+          </a:schemeClr>
+        </a:solidFill>
+      </a:ln>
+    </cs:spPr>
+    <cs:defRPr sz="900" kern="1200"/>
+    <cs:bodyPr rot="0" spcFirstLastPara="1" vertOverflow="clip" horzOverflow="clip" vert="horz" wrap="square" lIns="36576" tIns="18288" rIns="36576" bIns="18288" anchor="ctr" anchorCtr="1">
+      <a:spAutoFit/>
+    </cs:bodyPr>
+  </cs:dataLabelCallout>
+  <cs:dataPoint>
+    <cs:lnRef idx="0"/>
+    <cs:fillRef idx="1">
+      <cs:styleClr val="auto"/>
+    </cs:fillRef>
+    <cs:effectRef idx="0"/>
+    <cs:fontRef idx="minor">
+      <a:schemeClr val="tx1"/>
+    </cs:fontRef>
+    <cs:spPr>
+      <a:solidFill>
+        <a:schemeClr val="phClr"/>
+      </a:solidFill>
+    </cs:spPr>
+  </cs:dataPoint>
+  <cs:dataPoint3D>
+    <cs:lnRef idx="0"/>
+    <cs:fillRef idx="1">
+      <cs:styleClr val="auto"/>
+    </cs:fillRef>
+    <cs:effectRef idx="0"/>
+    <cs:fontRef idx="minor">
+      <a:schemeClr val="tx1"/>
+    </cs:fontRef>
+    <cs:spPr>
+      <a:solidFill>
+        <a:schemeClr val="phClr"/>
+      </a:solidFill>
+    </cs:spPr>
+  </cs:dataPoint3D>
+  <cs:dataPointLine>
+    <cs:lnRef idx="0">
+      <cs:styleClr val="auto"/>
+    </cs:lnRef>
+    <cs:fillRef idx="1"/>
+    <cs:effectRef idx="0"/>
+    <cs:fontRef idx="minor">
+      <a:schemeClr val="tx1"/>
+    </cs:fontRef>
+    <cs:spPr>
+      <a:ln w="28575" cap="rnd">
+        <a:solidFill>
+          <a:schemeClr val="phClr"/>
+        </a:solidFill>
+        <a:round/>
+      </a:ln>
+    </cs:spPr>
+  </cs:dataPointLine>
+  <cs:dataPointMarker>
+    <cs:lnRef idx="0">
+      <cs:styleClr val="auto"/>
+    </cs:lnRef>
+    <cs:fillRef idx="1">
+      <cs:styleClr val="auto"/>
+    </cs:fillRef>
+    <cs:effectRef idx="0"/>
+    <cs:fontRef idx="minor">
+      <a:schemeClr val="tx1"/>
+    </cs:fontRef>
+    <cs:spPr>
+      <a:solidFill>
+        <a:schemeClr val="phClr"/>
+      </a:solidFill>
+      <a:ln w="9525">
+        <a:solidFill>
+          <a:schemeClr val="phClr"/>
+        </a:solidFill>
+      </a:ln>
+    </cs:spPr>
+  </cs:dataPointMarker>
+  <cs:dataPointMarkerLayout symbol="circle" size="5"/>
+  <cs:dataPointWireframe>
+    <cs:lnRef idx="0">
+      <cs:styleClr val="auto"/>
+    </cs:lnRef>
+    <cs:fillRef idx="1"/>
+    <cs:effectRef idx="0"/>
+    <cs:fontRef idx="minor">
+      <a:schemeClr val="tx1"/>
+    </cs:fontRef>
+    <cs:spPr>
+      <a:ln w="9525" cap="rnd">
+        <a:solidFill>
+          <a:schemeClr val="phClr"/>
+        </a:solidFill>
+        <a:round/>
+      </a:ln>
+    </cs:spPr>
+  </cs:dataPointWireframe>
+  <cs:dataTable>
+    <cs:lnRef idx="0"/>
+    <cs:fillRef idx="0"/>
+    <cs:effectRef idx="0"/>
+    <cs:fontRef idx="minor">
+      <a:schemeClr val="tx1">
+        <a:lumMod val="65000"/>
+        <a:lumOff val="35000"/>
+      </a:schemeClr>
+    </cs:fontRef>
+    <cs:spPr>
+      <a:noFill/>
+      <a:ln w="9525" cap="flat" cmpd="sng" algn="ctr">
+        <a:solidFill>
+          <a:schemeClr val="tx1">
+            <a:lumMod val="15000"/>
+            <a:lumOff val="85000"/>
+          </a:schemeClr>
+        </a:solidFill>
+        <a:round/>
+      </a:ln>
+    </cs:spPr>
+    <cs:defRPr sz="900" kern="1200"/>
+  </cs:dataTable>
+  <cs:downBar>
+    <cs:lnRef idx="0"/>
+    <cs:fillRef idx="0"/>
+    <cs:effectRef idx="0"/>
+    <cs:fontRef idx="minor">
+      <a:schemeClr val="dk1"/>
+    </cs:fontRef>
+    <cs:spPr>
+      <a:solidFill>
+        <a:schemeClr val="dk1">
+          <a:lumMod val="65000"/>
+          <a:lumOff val="35000"/>
+        </a:schemeClr>
+      </a:solidFill>
+      <a:ln w="9525">
+        <a:solidFill>
+          <a:schemeClr val="tx1">
+            <a:lumMod val="65000"/>
+            <a:lumOff val="35000"/>
+          </a:schemeClr>
+        </a:solidFill>
+      </a:ln>
+    </cs:spPr>
+  </cs:downBar>
+  <cs:dropLine>
+    <cs:lnRef idx="0"/>
+    <cs:fillRef idx="0"/>
+    <cs:effectRef idx="0"/>
+    <cs:fontRef idx="minor">
+      <a:schemeClr val="tx1"/>
+    </cs:fontRef>
+    <cs:spPr>
+      <a:ln w="9525" cap="flat" cmpd="sng" algn="ctr">
+        <a:solidFill>
+          <a:schemeClr val="tx1">
+            <a:lumMod val="35000"/>
+            <a:lumOff val="65000"/>
+          </a:schemeClr>
+        </a:solidFill>
+        <a:round/>
+      </a:ln>
+    </cs:spPr>
+  </cs:dropLine>
+  <cs:errorBar>
+    <cs:lnRef idx="0"/>
+    <cs:fillRef idx="0"/>
+    <cs:effectRef idx="0"/>
+    <cs:fontRef idx="minor">
+      <a:schemeClr val="tx1"/>
+    </cs:fontRef>
+    <cs:spPr>
+      <a:ln w="9525" cap="flat" cmpd="sng" algn="ctr">
+        <a:solidFill>
+          <a:schemeClr val="tx1">
+            <a:lumMod val="65000"/>
+            <a:lumOff val="35000"/>
+          </a:schemeClr>
+        </a:solidFill>
+        <a:round/>
+      </a:ln>
+    </cs:spPr>
+  </cs:errorBar>
+  <cs:floor>
+    <cs:lnRef idx="0"/>
+    <cs:fillRef idx="0"/>
+    <cs:effectRef idx="0"/>
+    <cs:fontRef idx="minor">
+      <a:schemeClr val="tx1"/>
+    </cs:fontRef>
+    <cs:spPr>
+      <a:noFill/>
+      <a:ln>
+        <a:noFill/>
+      </a:ln>
+    </cs:spPr>
+  </cs:floor>
+  <cs:gridlineMajor>
+    <cs:lnRef idx="0"/>
+    <cs:fillRef idx="0"/>
+    <cs:effectRef idx="0"/>
+    <cs:fontRef idx="minor">
+      <a:schemeClr val="tx1"/>
+    </cs:fontRef>
+    <cs:spPr>
+      <a:ln w="9525" cap="flat" cmpd="sng" algn="ctr">
+        <a:solidFill>
+          <a:schemeClr val="tx1">
+            <a:lumMod val="15000"/>
+            <a:lumOff val="85000"/>
+          </a:schemeClr>
+        </a:solidFill>
+        <a:round/>
+      </a:ln>
+    </cs:spPr>
+  </cs:gridlineMajor>
+  <cs:gridlineMinor>
+    <cs:lnRef idx="0"/>
+    <cs:fillRef idx="0"/>
+    <cs:effectRef idx="0"/>
+    <cs:fontRef idx="minor">
+      <a:schemeClr val="tx1"/>
+    </cs:fontRef>
+    <cs:spPr>
+      <a:ln w="9525" cap="flat" cmpd="sng" algn="ctr">
+        <a:solidFill>
+          <a:schemeClr val="tx1">
+            <a:lumMod val="5000"/>
+            <a:lumOff val="95000"/>
+          </a:schemeClr>
+        </a:solidFill>
+        <a:round/>
+      </a:ln>
+    </cs:spPr>
+  </cs:gridlineMinor>
+  <cs:hiLoLine>
+    <cs:lnRef idx="0"/>
+    <cs:fillRef idx="0"/>
+    <cs:effectRef idx="0"/>
+    <cs:fontRef idx="minor">
+      <a:schemeClr val="tx1"/>
+    </cs:fontRef>
+    <cs:spPr>
+      <a:ln w="9525" cap="flat" cmpd="sng" algn="ctr">
+        <a:solidFill>
+          <a:schemeClr val="tx1">
+            <a:lumMod val="75000"/>
+            <a:lumOff val="25000"/>
+          </a:schemeClr>
+        </a:solidFill>
+        <a:round/>
+      </a:ln>
+    </cs:spPr>
+  </cs:hiLoLine>
+  <cs:leaderLine>
+    <cs:lnRef idx="0"/>
+    <cs:fillRef idx="0"/>
+    <cs:effectRef idx="0"/>
+    <cs:fontRef idx="minor">
+      <a:schemeClr val="tx1"/>
+    </cs:fontRef>
+    <cs:spPr>
+      <a:ln w="9525" cap="flat" cmpd="sng" algn="ctr">
+        <a:solidFill>
+          <a:schemeClr val="tx1">
+            <a:lumMod val="35000"/>
+            <a:lumOff val="65000"/>
+          </a:schemeClr>
+        </a:solidFill>
+        <a:round/>
+      </a:ln>
+    </cs:spPr>
+  </cs:leaderLine>
+  <cs:legend>
+    <cs:lnRef idx="0"/>
+    <cs:fillRef idx="0"/>
+    <cs:effectRef idx="0"/>
+    <cs:fontRef idx="minor">
+      <a:schemeClr val="tx1">
+        <a:lumMod val="65000"/>
+        <a:lumOff val="35000"/>
+      </a:schemeClr>
+    </cs:fontRef>
+    <cs:defRPr sz="900" kern="1200"/>
+  </cs:legend>
+  <cs:plotArea mods="allowNoFillOverride allowNoLineOverride">
+    <cs:lnRef idx="0"/>
+    <cs:fillRef idx="0"/>
+    <cs:effectRef idx="0"/>
+    <cs:fontRef idx="minor">
+      <a:schemeClr val="tx1"/>
+    </cs:fontRef>
+  </cs:plotArea>
+  <cs:plotArea3D mods="allowNoFillOverride allowNoLineOverride">
+    <cs:lnRef idx="0"/>
+    <cs:fillRef idx="0"/>
+    <cs:effectRef idx="0"/>
+    <cs:fontRef idx="minor">
+      <a:schemeClr val="tx1"/>
+    </cs:fontRef>
+  </cs:plotArea3D>
+  <cs:seriesAxis>
+    <cs:lnRef idx="0"/>
+    <cs:fillRef idx="0"/>
+    <cs:effectRef idx="0"/>
+    <cs:fontRef idx="minor">
+      <a:schemeClr val="tx1">
+        <a:lumMod val="65000"/>
+        <a:lumOff val="35000"/>
+      </a:schemeClr>
+    </cs:fontRef>
+    <cs:defRPr sz="900" kern="1200"/>
+  </cs:seriesAxis>
+  <cs:seriesLine>
+    <cs:lnRef idx="0"/>
+    <cs:fillRef idx="0"/>
+    <cs:effectRef idx="0"/>
+    <cs:fontRef idx="minor">
+      <a:schemeClr val="tx1"/>
+    </cs:fontRef>
+    <cs:spPr>
+      <a:ln w="9525" cap="flat" cmpd="sng" algn="ctr">
+        <a:solidFill>
+          <a:schemeClr val="tx1">
+            <a:lumMod val="35000"/>
+            <a:lumOff val="65000"/>
+          </a:schemeClr>
+        </a:solidFill>
+        <a:round/>
+      </a:ln>
+    </cs:spPr>
+  </cs:seriesLine>
+  <cs:title>
+    <cs:lnRef idx="0"/>
+    <cs:fillRef idx="0"/>
+    <cs:effectRef idx="0"/>
+    <cs:fontRef idx="minor">
+      <a:schemeClr val="tx1">
+        <a:lumMod val="65000"/>
+        <a:lumOff val="35000"/>
+      </a:schemeClr>
+    </cs:fontRef>
+    <cs:defRPr sz="1400" b="0" kern="1200" spc="0" baseline="0"/>
+  </cs:title>
+  <cs:trendline>
+    <cs:lnRef idx="0">
+      <cs:styleClr val="auto"/>
+    </cs:lnRef>
+    <cs:fillRef idx="0"/>
+    <cs:effectRef idx="0"/>
+    <cs:fontRef idx="minor">
+      <a:schemeClr val="tx1"/>
+    </cs:fontRef>
+    <cs:spPr>
+      <a:ln w="19050" cap="rnd">
+        <a:solidFill>
+          <a:schemeClr val="phClr"/>
+        </a:solidFill>
+        <a:prstDash val="sysDot"/>
+      </a:ln>
+    </cs:spPr>
+  </cs:trendline>
+  <cs:trendlineLabel>
+    <cs:lnRef idx="0"/>
+    <cs:fillRef idx="0"/>
+    <cs:effectRef idx="0"/>
+    <cs:fontRef idx="minor">
+      <a:schemeClr val="tx1">
+        <a:lumMod val="65000"/>
+        <a:lumOff val="35000"/>
+      </a:schemeClr>
+    </cs:fontRef>
+    <cs:defRPr sz="900" kern="1200"/>
+  </cs:trendlineLabel>
+  <cs:upBar>
+    <cs:lnRef idx="0"/>
+    <cs:fillRef idx="0"/>
+    <cs:effectRef idx="0"/>
+    <cs:fontRef idx="minor">
+      <a:schemeClr val="dk1"/>
+    </cs:fontRef>
+    <cs:spPr>
+      <a:solidFill>
+        <a:schemeClr val="lt1"/>
+      </a:solidFill>
+      <a:ln w="9525">
+        <a:solidFill>
+          <a:schemeClr val="tx1">
+            <a:lumMod val="15000"/>
+            <a:lumOff val="85000"/>
+          </a:schemeClr>
+        </a:solidFill>
+      </a:ln>
+    </cs:spPr>
+  </cs:upBar>
+  <cs:valueAxis>
+    <cs:lnRef idx="0"/>
+    <cs:fillRef idx="0"/>
+    <cs:effectRef idx="0"/>
+    <cs:fontRef idx="minor">
+      <a:schemeClr val="tx1">
+        <a:lumMod val="65000"/>
+        <a:lumOff val="35000"/>
+      </a:schemeClr>
+    </cs:fontRef>
+    <cs:defRPr sz="900" kern="1200"/>
+  </cs:valueAxis>
+  <cs:wall>
+    <cs:lnRef idx="0"/>
+    <cs:fillRef idx="0"/>
+    <cs:effectRef idx="0"/>
+    <cs:fontRef idx="minor">
+      <a:schemeClr val="tx1"/>
+    </cs:fontRef>
+    <cs:spPr>
+      <a:noFill/>
+      <a:ln>
+        <a:noFill/>
+      </a:ln>
+    </cs:spPr>
+  </cs:wall>
+</cs:chartStyle>
 </file>
 
 <file path=word/theme/theme1.xml><?xml version="1.0" encoding="utf-8"?>

</xml_diff>

<commit_message>
Edited mistake made in sections
</commit_message>
<xml_diff>
--- a/report/Report_AVCAD.docx
+++ b/report/Report_AVCAD.docx
@@ -6673,24 +6673,12 @@
     </w:p>
     <w:p>
       <w:pPr>
-        <w:pStyle w:val="BodyText"/>
-        <w:spacing w:before="26"/>
-      </w:pPr>
-    </w:p>
-    <w:p>
-      <w:pPr>
         <w:pStyle w:val="Heading1"/>
-        <w:numPr>
-          <w:ilvl w:val="1"/>
-          <w:numId w:val="2"/>
-        </w:numPr>
         <w:tabs>
           <w:tab w:val="left" w:pos="745"/>
         </w:tabs>
-      </w:pPr>
-      <w:r>
-        <w:t>Changes in agricultural area / land use</w:t>
-      </w:r>
+        <w:ind w:left="0" w:firstLine="0"/>
+      </w:pPr>
     </w:p>
     <w:p>
       <w:pPr>

</xml_diff>